<commit_message>
feat: harden OSS Contest product readiness
</commit_message>
<xml_diff>
--- a/artifacts/submission/2026-osscontest/final/2026 오픈소스 개발자대회 결과보고서_접수번호(ClaimGate).docx
+++ b/artifacts/submission/2026-osscontest/final/2026 오픈소스 개발자대회 결과보고서_접수번호(ClaimGate).docx
@@ -1202,7 +1202,7 @@
                 <w:rFonts w:ascii="Malgun Gothic" w:hAnsi="Malgun Gothic"/>
                 <w:sz w:val="20"/>
               </w:rPr>
-              <w:t>• 생성형 AI가 만든 자연스러운 문장도 출처·값·날짜·기관이 틀릴 수 있으나, 기존 도구는 생성 이후의 책임 있는 검토와 인계를 제품화하지 못한다.</w:t>
+              <w:t>• 생성형 AI 문장은 자연스러워도 출처·값·날짜·기관이 틀릴 수 있다. ClaimGate는 생성 이후의 검토 책임과 재사용 조건을 코드로 명시한다.</w:t>
             </w:r>
           </w:p>
           <w:p>
@@ -1214,7 +1214,7 @@
                 <w:rFonts w:ascii="Malgun Gothic" w:hAnsi="Malgun Gothic"/>
                 <w:sz w:val="20"/>
               </w:rPr>
-              <w:t>• 목표: AI는 후보 주장과 근거 후보만 제안하고, 공식 데이터의 위치·명시적 규칙·사람의 최종 판정으로 검증된 주장만 재사용한다.</w:t>
+              <w:t>• 목표: AI는 후보 주장·근거만 제안하고, Source Anchor·명시적 규칙·사람의 최종 판정으로 승인된 주장만 Evidence Pack에 넣는다.</w:t>
             </w:r>
           </w:p>
           <w:p>
@@ -1226,7 +1226,7 @@
                 <w:rFonts w:ascii="Malgun Gothic" w:hAnsi="Malgun Gothic"/>
                 <w:sz w:val="20"/>
               </w:rPr>
-              <w:t>• 핵심 원칙: No Anchor, No Claim / AI Curator, Not Judge / Evidence Pack First.</w:t>
+              <w:t>• 불변식: No Anchor, No Claim / AI Curator, Not Judge / deterministic risk / Evidence Pack First.</w:t>
             </w:r>
           </w:p>
         </w:tc>
@@ -1319,7 +1319,7 @@
                 <w:rFonts w:ascii="Malgun Gothic" w:hAnsi="Malgun Gothic"/>
                 <w:sz w:val="20"/>
               </w:rPr>
-              <w:t>• 선택적 로컬 AI: Ollama-compatible Gemma 4 12B(candidate-only), repo-local sparse RAG</w:t>
+              <w:t>• 선택적 로컬 AI: Gemma 4 12B candidate extractor, repo-local sparse RAG, bounded QLoRA adapter evaluation</w:t>
             </w:r>
           </w:p>
           <w:p>
@@ -1642,7 +1642,7 @@
                 <w:rFonts w:ascii="Malgun Gothic" w:hAnsi="Malgun Gothic"/>
                 <w:sz w:val="20"/>
               </w:rPr>
-              <w:t>[핵심 기능] 출처 없는 검증 차단, 데이터 행·셀·문장 범위 Source Anchor, 값/단위/날짜/기관 불일치 rule trace, Green Sampling, reviewer terminal decision, verified/corrected-only Evidence Pack.</w:t>
+              <w:t>[서면 1/5 프로젝트 구조 및 코드 완성도] strict TypeScript 패키지 경계와 순수 core를 유지한다. 출처 없는 verified/corrected 전이, AI의 위험·판정·투영, 미승인 Evidence Pack을 fail-closed로 거부한다.</w:t>
             </w:r>
           </w:p>
           <w:p>
@@ -1654,7 +1654,7 @@
                 <w:rFonts w:ascii="Malgun Gothic" w:hAnsi="Malgun Gothic"/>
                 <w:sz w:val="20"/>
               </w:rPr>
-              <w:t>[개발 과정] core 불변식 테스트 → 3개 DomainPack conformance → MOFA ODA 3개 위험 시나리오 → controlled UI → local Gemma candidate-only adapter → 제출 과장 방지·재현성·성능·보안 게이트.</w:t>
+              <w:t>[서면 2/5 오픈소스 프로젝트로의 발전 가능성] core/UI 계약을 고정하고 DomainPack이 fixture·rule·copy를 확장한다. civic·health·MOFA ODA 3개 팩과 conformance kit가 새 팩의 호환성을 검사한다.</w:t>
             </w:r>
           </w:p>
           <w:p>
@@ -1666,7 +1666,7 @@
                 <w:rFonts w:ascii="Malgun Gothic" w:hAnsi="Malgun Gothic"/>
                 <w:sz w:val="20"/>
               </w:rPr>
-              <w:t>[실행] pnpm install --frozen-lockfile &amp;&amp; pnpm eval:framework. 데모: pnpm demo. 실제 local model 경로: pnpm demo:ai:gemma.</w:t>
+              <w:t>[서면 3/5 개발 문서의 구체성] README의 Node 20+/pnpm quickstart, CONTRIBUTING의 검증 절차, SECURITY의 신뢰경계, 패키지별 API 문서로 설치→데모→확장을 재현한다.</w:t>
             </w:r>
           </w:p>
           <w:p>
@@ -1678,7 +1678,7 @@
                 <w:rFonts w:ascii="Malgun Gothic" w:hAnsi="Malgun Gothic"/>
                 <w:sz w:val="20"/>
               </w:rPr>
-              <w:t>[검증] workspace unit tests 192개, core 103개, local-AI 20개, conformance 8개. clean-clone, deployment contract, submission evidence, kbctl/fmon 검증 포함.</w:t>
+              <w:t>[실행·기능테스트] pnpm install --frozen-lockfile → pnpm demo → pnpm eval:framework. unit/conformance/e2e/runbook/clean-clone/deployment/submission negative controls를 workspace에서 자동 실행한다.</w:t>
             </w:r>
           </w:p>
           <w:p>
@@ -1823,7 +1823,7 @@
                 <w:rFonts w:ascii="Malgun Gothic" w:hAnsi="Malgun Gothic"/>
                 <w:sz w:val="20"/>
               </w:rPr>
-              <w:t>• 활용: 공공기관·연구·보건·시민데이터 등 AI 초안의 고위험 문장을 근거 중심 reviewer workflow로 전환.</w:t>
+              <w:t>[활용성] 공공기관·연구·보건·시민데이터의 AI 초안을 주장 단위 reviewer workflow로 바꾸고, 근거 위치·규칙 trace·사람의 결정을 함께 인계한다.</w:t>
             </w:r>
           </w:p>
           <w:p>
@@ -1835,7 +1835,7 @@
                 <w:rFonts w:ascii="Malgun Gothic" w:hAnsi="Malgun Gothic"/>
                 <w:sz w:val="20"/>
               </w:rPr>
-              <w:t>• 오픈소스 확장: core/UI 계약은 유지하고 DomainPack만 교체하여 커뮤니티가 fixture·rule·copy를 추가 가능.</w:t>
+              <w:t>[작품 데모(완성도)] offline fixture만으로 RED/YELLOW/GREEN 분류, 정정·검증, Evidence Pack export가 반복 실행된다. local Gemma/RAG/QLoRA는 선택 기능이며 core 판정 권한을 갖지 않는다.</w:t>
             </w:r>
           </w:p>
           <w:p>
@@ -1847,7 +1847,19 @@
                 <w:rFonts w:ascii="Malgun Gothic" w:hAnsi="Malgun Gothic"/>
                 <w:sz w:val="20"/>
               </w:rPr>
-              <w:t>• 향후: 읽기 전용 공공데이터 adapter, 제한 파일럿, 검토시간·재확인시간·정정 재사용률 측정. 현재는 운영 정확도·고객 채택·시간 절감 수치를 주장하지 않음.</w:t>
+              <w:t>[커뮤니티 확장 가능성] CONTRIBUTING·Issue 양식·conformance kit로 DomainPack 제안과 결함 보고 경로를 제공한다. 외부 contributor·PR 채택 실적은 아직 없으며 향후 공개 운영으로 검증한다.</w:t>
+            </w:r>
+          </w:p>
+          <w:p>
+            <w:pPr>
+              <w:spacing w:after="40"/>
+            </w:pPr>
+            <w:r>
+              <w:rPr>
+                <w:rFonts w:ascii="Malgun Gothic" w:hAnsi="Malgun Gothic"/>
+                <w:sz w:val="20"/>
+              </w:rPr>
+              <w:t>[향후 검증] 읽기 전용 공공데이터 adapter와 제한 파일럿으로 검토시간·재확인시간·정정 재사용률을 측정한다. 현재 운영 정확도·고객 채택·시간 절감 수치는 주장하지 않는다.</w:t>
             </w:r>
           </w:p>
         </w:tc>
@@ -1928,7 +1940,7 @@
                 <w:rFonts w:ascii="Malgun Gothic" w:hAnsi="Malgun Gothic"/>
                 <w:sz w:val="20"/>
               </w:rPr>
-              <w:t>[혁신성] AI 답변을 더 잘 생성하는 대신, 주장 단위의 근거·위험·사람의 결정·재사용 산출물을 하나의 검토 프로토콜로 만든다.</w:t>
+              <w:t>[서면 4/5 프로젝트 혁신성] 더 많은 답을 생성하는 대신, 주장 단위 Source Anchor→deterministic risk→Human Review→Evidence Pack을 하나의 검토 프로토콜로 구현한다.</w:t>
             </w:r>
           </w:p>
           <w:p>
@@ -1940,7 +1952,7 @@
                 <w:rFonts w:ascii="Malgun Gothic" w:hAnsi="Malgun Gothic"/>
                 <w:sz w:val="20"/>
               </w:rPr>
-              <w:t>[관리체계] MIT LICENSE, CONTRIBUTING, SECURITY, THIRD_PARTY_LICENSES, 125개 commit, kbctl SSOT, 자동 lint/typecheck/test/negative controls. 개인 프로젝트이므로 허위 PR/협업 이력을 주장하지 않는다.</w:t>
+              <w:t>[서면 5/5 프로젝트 협업 및 관리체계] MIT LICENSE, CONTRIBUTING, SECURITY, kbctl SSOT, 120+ commits와 자동 lint/typecheck/test를 운영한다. 현재 1인 개발이므로 외부 Review·PR·커뮤니티 활동 이력을 과장하지 않는다.</w:t>
             </w:r>
           </w:p>
           <w:p>
@@ -1952,7 +1964,7 @@
                 <w:rFonts w:ascii="Malgun Gothic" w:hAnsi="Malgun Gothic"/>
                 <w:sz w:val="20"/>
               </w:rPr>
-              <w:t>[한계] live OpenAPI·production vector DB·운영 정확도·실사용 효과는 future scope. 공개 배포의 cache/security header 5개는 아직 hardening 필요.</w:t>
+              <w:t>[오픈소스SW 적절성·라이선스 검증] React/Vite/Vitest/Go OSS를 정상 실행 경로에 사용하고, LICENSE·THIRD_PARTY_LICENSES·붙임 SBOM·AI 모델 명세로 식별·충돌 여부를 점검한다.</w:t>
             </w:r>
           </w:p>
           <w:p>
@@ -1964,7 +1976,7 @@
                 <w:rFonts w:ascii="Malgun Gothic" w:hAnsi="Malgun Gothic"/>
                 <w:sz w:val="20"/>
               </w:rPr>
-              <w:t>[로드맵] v0 framework 안정화 → ODA 시제품 → 실무 파일럿 → adapter 생태계와 community DomainPack registry.</w:t>
+              <w:t>[관리 증거] CODE_OF_CONDUCT.md, GOVERNANCE.md, ROADMAP.md, .github/ISSUE_TEMPLATE/bug_report.yml, .github/ISSUE_TEMPLATE/domain_pack.yml</w:t>
             </w:r>
           </w:p>
           <w:p>
@@ -1976,7 +1988,7 @@
                 <w:rFonts w:ascii="Malgun Gothic" w:hAnsi="Malgun Gothic"/>
                 <w:sz w:val="20"/>
               </w:rPr>
-              <w:t>[소감] AI 시대의 핵심은 생성량보다 검증 가능한 판단과 인계다. 코드·문서·검증을 함께 공개해 재사용 가능한 신뢰 경계를 만들었다.</w:t>
+              <w:t>[한계·로드맵] live OpenAPI·production vector DB·실사용 효과는 future scope다. framework 안정화→ODA 시제품→파일럿→community DomainPack registry 순으로 공개 검증한다.</w:t>
             </w:r>
           </w:p>
         </w:tc>
@@ -2448,7 +2460,7 @@
                 <w:b w:val="0"/>
                 <w:sz w:val="20"/>
               </w:rPr>
-              <w:t>React</w:t>
+              <w:t>@types/node</w:t>
             </w:r>
           </w:p>
         </w:tc>
@@ -2486,7 +2498,7 @@
                 <w:b w:val="0"/>
                 <w:sz w:val="20"/>
               </w:rPr>
-              <w:t>18.3.1</w:t>
+              <w:t>22.10.2</w:t>
             </w:r>
           </w:p>
         </w:tc>
@@ -2562,7 +2574,7 @@
                 <w:b w:val="0"/>
                 <w:sz w:val="20"/>
               </w:rPr>
-              <w:t>https://github.com/facebook/react</w:t>
+              <w:t>https://github.com/DefinitelyTyped/DefinitelyTyped</w:t>
             </w:r>
           </w:p>
         </w:tc>
@@ -2600,7 +2612,7 @@
                 <w:b w:val="0"/>
                 <w:sz w:val="20"/>
               </w:rPr>
-              <w:t>UI rendering</w:t>
+              <w:t>types: TypeScript declarations for the Node.js APIs used by build and test scripts.</w:t>
             </w:r>
           </w:p>
         </w:tc>
@@ -2681,7 +2693,7 @@
                 <w:b w:val="0"/>
                 <w:sz w:val="20"/>
               </w:rPr>
-              <w:t>React DOM</w:t>
+              <w:t>@types/react</w:t>
             </w:r>
           </w:p>
         </w:tc>
@@ -2719,7 +2731,7 @@
                 <w:b w:val="0"/>
                 <w:sz w:val="20"/>
               </w:rPr>
-              <w:t>18.3.1</w:t>
+              <w:t>18.3.18</w:t>
             </w:r>
           </w:p>
         </w:tc>
@@ -2795,7 +2807,7 @@
                 <w:b w:val="0"/>
                 <w:sz w:val="20"/>
               </w:rPr>
-              <w:t>https://github.com/facebook/react</w:t>
+              <w:t>https://github.com/DefinitelyTyped/DefinitelyTyped</w:t>
             </w:r>
           </w:p>
         </w:tc>
@@ -2833,7 +2845,7 @@
                 <w:b w:val="0"/>
                 <w:sz w:val="20"/>
               </w:rPr>
-              <w:t>Browser UI integration</w:t>
+              <w:t>types: TypeScript declarations for React components.</w:t>
             </w:r>
           </w:p>
         </w:tc>
@@ -2914,7 +2926,7 @@
                 <w:b w:val="0"/>
                 <w:sz w:val="20"/>
               </w:rPr>
-              <w:t>Zustand</w:t>
+              <w:t>@types/react-dom</w:t>
             </w:r>
           </w:p>
         </w:tc>
@@ -2952,7 +2964,7 @@
                 <w:b w:val="0"/>
                 <w:sz w:val="20"/>
               </w:rPr>
-              <w:t>4.5.5</w:t>
+              <w:t>18.3.5</w:t>
             </w:r>
           </w:p>
         </w:tc>
@@ -3028,7 +3040,7 @@
                 <w:b w:val="0"/>
                 <w:sz w:val="20"/>
               </w:rPr>
-              <w:t>https://github.com/pmndrs/zustand</w:t>
+              <w:t>https://github.com/DefinitelyTyped/DefinitelyTyped</w:t>
             </w:r>
           </w:p>
         </w:tc>
@@ -3066,7 +3078,7 @@
                 <w:b w:val="0"/>
                 <w:sz w:val="20"/>
               </w:rPr>
-              <w:t>Example app state</w:t>
+              <w:t>types: TypeScript declarations for React DOM rendering.</w:t>
             </w:r>
           </w:p>
         </w:tc>
@@ -3147,7 +3159,7 @@
                 <w:b w:val="0"/>
                 <w:sz w:val="20"/>
               </w:rPr>
-              <w:t>TypeScript</w:t>
+              <w:t>@vitejs/plugin-react</w:t>
             </w:r>
           </w:p>
         </w:tc>
@@ -3185,7 +3197,7 @@
                 <w:b w:val="0"/>
                 <w:sz w:val="20"/>
               </w:rPr>
-              <w:t>5.7.2</w:t>
+              <w:t>4.3.4</w:t>
             </w:r>
           </w:p>
         </w:tc>
@@ -3223,7 +3235,7 @@
                 <w:b w:val="0"/>
                 <w:sz w:val="20"/>
               </w:rPr>
-              <w:t>Apache-2.0</w:t>
+              <w:t>MIT</w:t>
             </w:r>
           </w:p>
         </w:tc>
@@ -3261,7 +3273,7 @@
                 <w:b w:val="0"/>
                 <w:sz w:val="20"/>
               </w:rPr>
-              <w:t>https://github.com/microsoft/TypeScript</w:t>
+              <w:t>https://github.com/vitejs/vite-plugin-react</w:t>
             </w:r>
           </w:p>
         </w:tc>
@@ -3299,7 +3311,7 @@
                 <w:b w:val="0"/>
                 <w:sz w:val="20"/>
               </w:rPr>
-              <w:t>Strict type checking</w:t>
+              <w:t>build: React transform support for the Vite example build.</w:t>
             </w:r>
           </w:p>
         </w:tc>
@@ -3380,7 +3392,7 @@
                 <w:b w:val="0"/>
                 <w:sz w:val="20"/>
               </w:rPr>
-              <w:t>Vite</w:t>
+              <w:t>react</w:t>
             </w:r>
           </w:p>
         </w:tc>
@@ -3418,7 +3430,7 @@
                 <w:b w:val="0"/>
                 <w:sz w:val="20"/>
               </w:rPr>
-              <w:t>5.4.11</w:t>
+              <w:t>18.3.1</w:t>
             </w:r>
           </w:p>
         </w:tc>
@@ -3494,7 +3506,7 @@
                 <w:b w:val="0"/>
                 <w:sz w:val="20"/>
               </w:rPr>
-              <w:t>https://github.com/vitejs/vite</w:t>
+              <w:t>https://github.com/facebook/react</w:t>
             </w:r>
           </w:p>
         </w:tc>
@@ -3532,7 +3544,7 @@
                 <w:b w:val="0"/>
                 <w:sz w:val="20"/>
               </w:rPr>
-              <w:t>Example build/preview</w:t>
+              <w:t>runtime: Controlled-component runtime for the evaluator UI.</w:t>
             </w:r>
           </w:p>
         </w:tc>
@@ -3613,7 +3625,7 @@
                 <w:b w:val="0"/>
                 <w:sz w:val="20"/>
               </w:rPr>
-              <w:t>Vitest</w:t>
+              <w:t>react-dom</w:t>
             </w:r>
           </w:p>
         </w:tc>
@@ -3651,7 +3663,7 @@
                 <w:b w:val="0"/>
                 <w:sz w:val="20"/>
               </w:rPr>
-              <w:t>2.1.8</w:t>
+              <w:t>18.3.1</w:t>
             </w:r>
           </w:p>
         </w:tc>
@@ -3727,7 +3739,7 @@
                 <w:b w:val="0"/>
                 <w:sz w:val="20"/>
               </w:rPr>
-              <w:t>https://github.com/vitest-dev/vitest</w:t>
+              <w:t>https://github.com/facebook/react</w:t>
             </w:r>
           </w:p>
         </w:tc>
@@ -3765,7 +3777,7 @@
                 <w:b w:val="0"/>
                 <w:sz w:val="20"/>
               </w:rPr>
-              <w:t>Unit/conformance tests</w:t>
+              <w:t>runtime: Browser renderer for the evaluator UI.</w:t>
             </w:r>
           </w:p>
         </w:tc>
@@ -3911,7 +3923,7 @@
                 <w:b w:val="0"/>
                 <w:sz w:val="20"/>
               </w:rPr>
-              <w:t>Library bundling</w:t>
+              <w:t>build: TypeScript package bundling for ClaimGate workspace packages.</w:t>
             </w:r>
           </w:p>
         </w:tc>
@@ -4057,7 +4069,7 @@
                 <w:b w:val="0"/>
                 <w:sz w:val="20"/>
               </w:rPr>
-              <w:t>TypeScript scripts</w:t>
+              <w:t>build: TypeScript runner for local demos and evaluator scripts.</w:t>
             </w:r>
           </w:p>
         </w:tc>
@@ -4107,7 +4119,7 @@
                 <w:b w:val="0"/>
                 <w:sz w:val="20"/>
               </w:rPr>
-              <w:t>Bubble Tea</w:t>
+              <w:t>typescript</w:t>
             </w:r>
           </w:p>
         </w:tc>
@@ -4131,7 +4143,7 @@
                 <w:b w:val="0"/>
                 <w:sz w:val="20"/>
               </w:rPr>
-              <w:t>1.3.4</w:t>
+              <w:t>5.7.2</w:t>
             </w:r>
           </w:p>
         </w:tc>
@@ -4155,7 +4167,7 @@
                 <w:b w:val="0"/>
                 <w:sz w:val="20"/>
               </w:rPr>
-              <w:t>MIT</w:t>
+              <w:t>Apache-2.0</w:t>
             </w:r>
           </w:p>
         </w:tc>
@@ -4179,7 +4191,7 @@
                 <w:b w:val="0"/>
                 <w:sz w:val="20"/>
               </w:rPr>
-              <w:t>https://github.com/charmbracelet/bubbletea</w:t>
+              <w:t>https://github.com/microsoft/TypeScript</w:t>
             </w:r>
           </w:p>
         </w:tc>
@@ -4203,7 +4215,7 @@
                 <w:b w:val="0"/>
                 <w:sz w:val="20"/>
               </w:rPr>
-              <w:t>FMON TUI runtime</w:t>
+              <w:t>build: Strict TypeScript compiler and type checker.</w:t>
             </w:r>
           </w:p>
         </w:tc>
@@ -4253,7 +4265,7 @@
                 <w:b w:val="0"/>
                 <w:sz w:val="20"/>
               </w:rPr>
-              <w:t>Bubbles</w:t>
+              <w:t>vite</w:t>
             </w:r>
           </w:p>
         </w:tc>
@@ -4277,7 +4289,7 @@
                 <w:b w:val="0"/>
                 <w:sz w:val="20"/>
               </w:rPr>
-              <w:t>0.20.0</w:t>
+              <w:t>5.4.11</w:t>
             </w:r>
           </w:p>
         </w:tc>
@@ -4325,7 +4337,7 @@
                 <w:b w:val="0"/>
                 <w:sz w:val="20"/>
               </w:rPr>
-              <w:t>https://github.com/charmbracelet/bubbles</w:t>
+              <w:t>https://github.com/vitejs/vite</w:t>
             </w:r>
           </w:p>
         </w:tc>
@@ -4349,7 +4361,7 @@
                 <w:b w:val="0"/>
                 <w:sz w:val="20"/>
               </w:rPr>
-              <w:t>FMON viewport</w:t>
+              <w:t>build: Static development and production build tool for the example UI.</w:t>
             </w:r>
           </w:p>
         </w:tc>
@@ -4399,7 +4411,7 @@
                 <w:b w:val="0"/>
                 <w:sz w:val="20"/>
               </w:rPr>
-              <w:t>Lip Gloss</w:t>
+              <w:t>vitest</w:t>
             </w:r>
           </w:p>
         </w:tc>
@@ -4423,7 +4435,7 @@
                 <w:b w:val="0"/>
                 <w:sz w:val="20"/>
               </w:rPr>
-              <w:t>1.0.0</w:t>
+              <w:t>2.1.8</w:t>
             </w:r>
           </w:p>
         </w:tc>
@@ -4471,6 +4483,736 @@
                 <w:b w:val="0"/>
                 <w:sz w:val="20"/>
               </w:rPr>
+              <w:t>https://github.com/vitest-dev/vitest</w:t>
+            </w:r>
+          </w:p>
+        </w:tc>
+        <w:tc>
+          <w:tcPr>
+            <w:tcW w:type="dxa" w:w="4449"/>
+          </w:tcPr>
+          <w:p>
+            <w:pPr>
+              <w:spacing w:after="0"/>
+            </w:pPr>
+            <w:r>
+              <w:rPr>
+                <w:rFonts w:ascii="Malgun Gothic" w:hAnsi="Malgun Gothic"/>
+                <w:sz w:val="20"/>
+              </w:rPr>
+            </w:r>
+            <w:r>
+              <w:rPr>
+                <w:rFonts w:ascii="Malgun Gothic" w:hAnsi="Malgun Gothic"/>
+                <w:b w:val="0"/>
+                <w:sz w:val="20"/>
+              </w:rPr>
+              <w:t>test: Deterministic unit and conformance test runner.</w:t>
+            </w:r>
+          </w:p>
+        </w:tc>
+      </w:tr>
+      <w:tr>
+        <w:tc>
+          <w:tcPr>
+            <w:tcW w:type="dxa" w:w="768"/>
+          </w:tcPr>
+          <w:p>
+            <w:pPr>
+              <w:spacing w:after="0"/>
+            </w:pPr>
+            <w:r>
+              <w:rPr>
+                <w:rFonts w:ascii="Malgun Gothic" w:hAnsi="Malgun Gothic"/>
+                <w:sz w:val="20"/>
+              </w:rPr>
+            </w:r>
+            <w:r>
+              <w:rPr>
+                <w:rFonts w:ascii="Malgun Gothic" w:hAnsi="Malgun Gothic"/>
+                <w:b w:val="0"/>
+                <w:sz w:val="20"/>
+              </w:rPr>
+              <w:t>12</w:t>
+            </w:r>
+          </w:p>
+        </w:tc>
+        <w:tc>
+          <w:tcPr>
+            <w:tcW w:type="dxa" w:w="1878"/>
+          </w:tcPr>
+          <w:p>
+            <w:pPr>
+              <w:spacing w:after="0"/>
+            </w:pPr>
+            <w:r>
+              <w:rPr>
+                <w:rFonts w:ascii="Malgun Gothic" w:hAnsi="Malgun Gothic"/>
+                <w:sz w:val="20"/>
+              </w:rPr>
+            </w:r>
+            <w:r>
+              <w:rPr>
+                <w:rFonts w:ascii="Malgun Gothic" w:hAnsi="Malgun Gothic"/>
+                <w:b w:val="0"/>
+                <w:sz w:val="20"/>
+              </w:rPr>
+              <w:t>zustand</w:t>
+            </w:r>
+          </w:p>
+        </w:tc>
+        <w:tc>
+          <w:tcPr>
+            <w:tcW w:type="dxa" w:w="1387"/>
+          </w:tcPr>
+          <w:p>
+            <w:pPr>
+              <w:spacing w:after="0"/>
+            </w:pPr>
+            <w:r>
+              <w:rPr>
+                <w:rFonts w:ascii="Malgun Gothic" w:hAnsi="Malgun Gothic"/>
+                <w:sz w:val="20"/>
+              </w:rPr>
+            </w:r>
+            <w:r>
+              <w:rPr>
+                <w:rFonts w:ascii="Malgun Gothic" w:hAnsi="Malgun Gothic"/>
+                <w:b w:val="0"/>
+                <w:sz w:val="20"/>
+              </w:rPr>
+              <w:t>4.5.5</w:t>
+            </w:r>
+          </w:p>
+        </w:tc>
+        <w:tc>
+          <w:tcPr>
+            <w:tcW w:type="dxa" w:w="1495"/>
+          </w:tcPr>
+          <w:p>
+            <w:pPr>
+              <w:spacing w:after="0"/>
+            </w:pPr>
+            <w:r>
+              <w:rPr>
+                <w:rFonts w:ascii="Malgun Gothic" w:hAnsi="Malgun Gothic"/>
+                <w:sz w:val="20"/>
+              </w:rPr>
+            </w:r>
+            <w:r>
+              <w:rPr>
+                <w:rFonts w:ascii="Malgun Gothic" w:hAnsi="Malgun Gothic"/>
+                <w:b w:val="0"/>
+                <w:sz w:val="20"/>
+              </w:rPr>
+              <w:t>MIT</w:t>
+            </w:r>
+          </w:p>
+        </w:tc>
+        <w:tc>
+          <w:tcPr>
+            <w:tcW w:type="dxa" w:w="4536"/>
+          </w:tcPr>
+          <w:p>
+            <w:pPr>
+              <w:spacing w:after="0"/>
+            </w:pPr>
+            <w:r>
+              <w:rPr>
+                <w:rFonts w:ascii="Malgun Gothic" w:hAnsi="Malgun Gothic"/>
+                <w:sz w:val="20"/>
+              </w:rPr>
+            </w:r>
+            <w:r>
+              <w:rPr>
+                <w:rFonts w:ascii="Malgun Gothic" w:hAnsi="Malgun Gothic"/>
+                <w:b w:val="0"/>
+                <w:sz w:val="20"/>
+              </w:rPr>
+              <w:t>https://github.com/pmndrs/zustand</w:t>
+            </w:r>
+          </w:p>
+        </w:tc>
+        <w:tc>
+          <w:tcPr>
+            <w:tcW w:type="dxa" w:w="4449"/>
+          </w:tcPr>
+          <w:p>
+            <w:pPr>
+              <w:spacing w:after="0"/>
+            </w:pPr>
+            <w:r>
+              <w:rPr>
+                <w:rFonts w:ascii="Malgun Gothic" w:hAnsi="Malgun Gothic"/>
+                <w:sz w:val="20"/>
+              </w:rPr>
+            </w:r>
+            <w:r>
+              <w:rPr>
+                <w:rFonts w:ascii="Malgun Gothic" w:hAnsi="Malgun Gothic"/>
+                <w:b w:val="0"/>
+                <w:sz w:val="20"/>
+              </w:rPr>
+              <w:t>runtime: Local client-side review workflow state for the example UI.</w:t>
+            </w:r>
+          </w:p>
+        </w:tc>
+      </w:tr>
+      <w:tr>
+        <w:tc>
+          <w:tcPr>
+            <w:tcW w:type="dxa" w:w="768"/>
+          </w:tcPr>
+          <w:p>
+            <w:pPr>
+              <w:spacing w:after="0"/>
+            </w:pPr>
+            <w:r>
+              <w:rPr>
+                <w:rFonts w:ascii="Malgun Gothic" w:hAnsi="Malgun Gothic"/>
+                <w:sz w:val="20"/>
+              </w:rPr>
+            </w:r>
+            <w:r>
+              <w:rPr>
+                <w:rFonts w:ascii="Malgun Gothic" w:hAnsi="Malgun Gothic"/>
+                <w:b w:val="0"/>
+                <w:sz w:val="20"/>
+              </w:rPr>
+              <w:t>13</w:t>
+            </w:r>
+          </w:p>
+        </w:tc>
+        <w:tc>
+          <w:tcPr>
+            <w:tcW w:type="dxa" w:w="1878"/>
+          </w:tcPr>
+          <w:p>
+            <w:pPr>
+              <w:spacing w:after="0"/>
+            </w:pPr>
+            <w:r>
+              <w:rPr>
+                <w:rFonts w:ascii="Malgun Gothic" w:hAnsi="Malgun Gothic"/>
+                <w:sz w:val="20"/>
+              </w:rPr>
+            </w:r>
+            <w:r>
+              <w:rPr>
+                <w:rFonts w:ascii="Malgun Gothic" w:hAnsi="Malgun Gothic"/>
+                <w:b w:val="0"/>
+                <w:sz w:val="20"/>
+              </w:rPr>
+              <w:t>github.com/aymanbagabas/go-osc52/v2</w:t>
+            </w:r>
+          </w:p>
+        </w:tc>
+        <w:tc>
+          <w:tcPr>
+            <w:tcW w:type="dxa" w:w="1387"/>
+          </w:tcPr>
+          <w:p>
+            <w:pPr>
+              <w:spacing w:after="0"/>
+            </w:pPr>
+            <w:r>
+              <w:rPr>
+                <w:rFonts w:ascii="Malgun Gothic" w:hAnsi="Malgun Gothic"/>
+                <w:sz w:val="20"/>
+              </w:rPr>
+            </w:r>
+            <w:r>
+              <w:rPr>
+                <w:rFonts w:ascii="Malgun Gothic" w:hAnsi="Malgun Gothic"/>
+                <w:b w:val="0"/>
+                <w:sz w:val="20"/>
+              </w:rPr>
+              <w:t>v2.0.1</w:t>
+            </w:r>
+          </w:p>
+        </w:tc>
+        <w:tc>
+          <w:tcPr>
+            <w:tcW w:type="dxa" w:w="1495"/>
+          </w:tcPr>
+          <w:p>
+            <w:pPr>
+              <w:spacing w:after="0"/>
+            </w:pPr>
+            <w:r>
+              <w:rPr>
+                <w:rFonts w:ascii="Malgun Gothic" w:hAnsi="Malgun Gothic"/>
+                <w:sz w:val="20"/>
+              </w:rPr>
+            </w:r>
+            <w:r>
+              <w:rPr>
+                <w:rFonts w:ascii="Malgun Gothic" w:hAnsi="Malgun Gothic"/>
+                <w:b w:val="0"/>
+                <w:sz w:val="20"/>
+              </w:rPr>
+              <w:t>MIT</w:t>
+            </w:r>
+          </w:p>
+        </w:tc>
+        <w:tc>
+          <w:tcPr>
+            <w:tcW w:type="dxa" w:w="4536"/>
+          </w:tcPr>
+          <w:p>
+            <w:pPr>
+              <w:spacing w:after="0"/>
+            </w:pPr>
+            <w:r>
+              <w:rPr>
+                <w:rFonts w:ascii="Malgun Gothic" w:hAnsi="Malgun Gothic"/>
+                <w:sz w:val="20"/>
+              </w:rPr>
+            </w:r>
+            <w:r>
+              <w:rPr>
+                <w:rFonts w:ascii="Malgun Gothic" w:hAnsi="Malgun Gothic"/>
+                <w:b w:val="0"/>
+                <w:sz w:val="20"/>
+              </w:rPr>
+              <w:t>https://github.com/aymanbagabas/go-osc52</w:t>
+            </w:r>
+          </w:p>
+        </w:tc>
+        <w:tc>
+          <w:tcPr>
+            <w:tcW w:type="dxa" w:w="4449"/>
+          </w:tcPr>
+          <w:p>
+            <w:pPr>
+              <w:spacing w:after="0"/>
+            </w:pPr>
+            <w:r>
+              <w:rPr>
+                <w:rFonts w:ascii="Malgun Gothic" w:hAnsi="Malgun Gothic"/>
+                <w:sz w:val="20"/>
+              </w:rPr>
+            </w:r>
+            <w:r>
+              <w:rPr>
+                <w:rFonts w:ascii="Malgun Gothic" w:hAnsi="Malgun Gothic"/>
+                <w:b w:val="0"/>
+                <w:sz w:val="20"/>
+              </w:rPr>
+              <w:t>indirect: Transitive terminal/runtime support for the FMON local TUI.</w:t>
+            </w:r>
+          </w:p>
+        </w:tc>
+      </w:tr>
+      <w:tr>
+        <w:tc>
+          <w:tcPr>
+            <w:tcW w:type="dxa" w:w="768"/>
+          </w:tcPr>
+          <w:p>
+            <w:pPr>
+              <w:spacing w:after="0"/>
+            </w:pPr>
+            <w:r>
+              <w:rPr>
+                <w:rFonts w:ascii="Malgun Gothic" w:hAnsi="Malgun Gothic"/>
+                <w:sz w:val="20"/>
+              </w:rPr>
+            </w:r>
+            <w:r>
+              <w:rPr>
+                <w:rFonts w:ascii="Malgun Gothic" w:hAnsi="Malgun Gothic"/>
+                <w:b w:val="0"/>
+                <w:sz w:val="20"/>
+              </w:rPr>
+              <w:t>14</w:t>
+            </w:r>
+          </w:p>
+        </w:tc>
+        <w:tc>
+          <w:tcPr>
+            <w:tcW w:type="dxa" w:w="1878"/>
+          </w:tcPr>
+          <w:p>
+            <w:pPr>
+              <w:spacing w:after="0"/>
+            </w:pPr>
+            <w:r>
+              <w:rPr>
+                <w:rFonts w:ascii="Malgun Gothic" w:hAnsi="Malgun Gothic"/>
+                <w:sz w:val="20"/>
+              </w:rPr>
+            </w:r>
+            <w:r>
+              <w:rPr>
+                <w:rFonts w:ascii="Malgun Gothic" w:hAnsi="Malgun Gothic"/>
+                <w:b w:val="0"/>
+                <w:sz w:val="20"/>
+              </w:rPr>
+              <w:t>github.com/charmbracelet/bubbles</w:t>
+            </w:r>
+          </w:p>
+        </w:tc>
+        <w:tc>
+          <w:tcPr>
+            <w:tcW w:type="dxa" w:w="1387"/>
+          </w:tcPr>
+          <w:p>
+            <w:pPr>
+              <w:spacing w:after="0"/>
+            </w:pPr>
+            <w:r>
+              <w:rPr>
+                <w:rFonts w:ascii="Malgun Gothic" w:hAnsi="Malgun Gothic"/>
+                <w:sz w:val="20"/>
+              </w:rPr>
+            </w:r>
+            <w:r>
+              <w:rPr>
+                <w:rFonts w:ascii="Malgun Gothic" w:hAnsi="Malgun Gothic"/>
+                <w:b w:val="0"/>
+                <w:sz w:val="20"/>
+              </w:rPr>
+              <w:t>v0.20.0</w:t>
+            </w:r>
+          </w:p>
+        </w:tc>
+        <w:tc>
+          <w:tcPr>
+            <w:tcW w:type="dxa" w:w="1495"/>
+          </w:tcPr>
+          <w:p>
+            <w:pPr>
+              <w:spacing w:after="0"/>
+            </w:pPr>
+            <w:r>
+              <w:rPr>
+                <w:rFonts w:ascii="Malgun Gothic" w:hAnsi="Malgun Gothic"/>
+                <w:sz w:val="20"/>
+              </w:rPr>
+            </w:r>
+            <w:r>
+              <w:rPr>
+                <w:rFonts w:ascii="Malgun Gothic" w:hAnsi="Malgun Gothic"/>
+                <w:b w:val="0"/>
+                <w:sz w:val="20"/>
+              </w:rPr>
+              <w:t>MIT</w:t>
+            </w:r>
+          </w:p>
+        </w:tc>
+        <w:tc>
+          <w:tcPr>
+            <w:tcW w:type="dxa" w:w="4536"/>
+          </w:tcPr>
+          <w:p>
+            <w:pPr>
+              <w:spacing w:after="0"/>
+            </w:pPr>
+            <w:r>
+              <w:rPr>
+                <w:rFonts w:ascii="Malgun Gothic" w:hAnsi="Malgun Gothic"/>
+                <w:sz w:val="20"/>
+              </w:rPr>
+            </w:r>
+            <w:r>
+              <w:rPr>
+                <w:rFonts w:ascii="Malgun Gothic" w:hAnsi="Malgun Gothic"/>
+                <w:b w:val="0"/>
+                <w:sz w:val="20"/>
+              </w:rPr>
+              <w:t>https://github.com/charmbracelet/bubbles</w:t>
+            </w:r>
+          </w:p>
+        </w:tc>
+        <w:tc>
+          <w:tcPr>
+            <w:tcW w:type="dxa" w:w="4449"/>
+          </w:tcPr>
+          <w:p>
+            <w:pPr>
+              <w:spacing w:after="0"/>
+            </w:pPr>
+            <w:r>
+              <w:rPr>
+                <w:rFonts w:ascii="Malgun Gothic" w:hAnsi="Malgun Gothic"/>
+                <w:sz w:val="20"/>
+              </w:rPr>
+            </w:r>
+            <w:r>
+              <w:rPr>
+                <w:rFonts w:ascii="Malgun Gothic" w:hAnsi="Malgun Gothic"/>
+                <w:b w:val="0"/>
+                <w:sz w:val="20"/>
+              </w:rPr>
+              <w:t>runtime: Reusable terminal UI components for FMON.</w:t>
+            </w:r>
+          </w:p>
+        </w:tc>
+      </w:tr>
+      <w:tr>
+        <w:tc>
+          <w:tcPr>
+            <w:tcW w:type="dxa" w:w="768"/>
+          </w:tcPr>
+          <w:p>
+            <w:pPr>
+              <w:spacing w:after="0"/>
+            </w:pPr>
+            <w:r>
+              <w:rPr>
+                <w:rFonts w:ascii="Malgun Gothic" w:hAnsi="Malgun Gothic"/>
+                <w:sz w:val="20"/>
+              </w:rPr>
+            </w:r>
+            <w:r>
+              <w:rPr>
+                <w:rFonts w:ascii="Malgun Gothic" w:hAnsi="Malgun Gothic"/>
+                <w:b w:val="0"/>
+                <w:sz w:val="20"/>
+              </w:rPr>
+              <w:t>15</w:t>
+            </w:r>
+          </w:p>
+        </w:tc>
+        <w:tc>
+          <w:tcPr>
+            <w:tcW w:type="dxa" w:w="1878"/>
+          </w:tcPr>
+          <w:p>
+            <w:pPr>
+              <w:spacing w:after="0"/>
+            </w:pPr>
+            <w:r>
+              <w:rPr>
+                <w:rFonts w:ascii="Malgun Gothic" w:hAnsi="Malgun Gothic"/>
+                <w:sz w:val="20"/>
+              </w:rPr>
+            </w:r>
+            <w:r>
+              <w:rPr>
+                <w:rFonts w:ascii="Malgun Gothic" w:hAnsi="Malgun Gothic"/>
+                <w:b w:val="0"/>
+                <w:sz w:val="20"/>
+              </w:rPr>
+              <w:t>github.com/charmbracelet/bubbletea</w:t>
+            </w:r>
+          </w:p>
+        </w:tc>
+        <w:tc>
+          <w:tcPr>
+            <w:tcW w:type="dxa" w:w="1387"/>
+          </w:tcPr>
+          <w:p>
+            <w:pPr>
+              <w:spacing w:after="0"/>
+            </w:pPr>
+            <w:r>
+              <w:rPr>
+                <w:rFonts w:ascii="Malgun Gothic" w:hAnsi="Malgun Gothic"/>
+                <w:sz w:val="20"/>
+              </w:rPr>
+            </w:r>
+            <w:r>
+              <w:rPr>
+                <w:rFonts w:ascii="Malgun Gothic" w:hAnsi="Malgun Gothic"/>
+                <w:b w:val="0"/>
+                <w:sz w:val="20"/>
+              </w:rPr>
+              <w:t>v1.3.4</w:t>
+            </w:r>
+          </w:p>
+        </w:tc>
+        <w:tc>
+          <w:tcPr>
+            <w:tcW w:type="dxa" w:w="1495"/>
+          </w:tcPr>
+          <w:p>
+            <w:pPr>
+              <w:spacing w:after="0"/>
+            </w:pPr>
+            <w:r>
+              <w:rPr>
+                <w:rFonts w:ascii="Malgun Gothic" w:hAnsi="Malgun Gothic"/>
+                <w:sz w:val="20"/>
+              </w:rPr>
+            </w:r>
+            <w:r>
+              <w:rPr>
+                <w:rFonts w:ascii="Malgun Gothic" w:hAnsi="Malgun Gothic"/>
+                <w:b w:val="0"/>
+                <w:sz w:val="20"/>
+              </w:rPr>
+              <w:t>MIT</w:t>
+            </w:r>
+          </w:p>
+        </w:tc>
+        <w:tc>
+          <w:tcPr>
+            <w:tcW w:type="dxa" w:w="4536"/>
+          </w:tcPr>
+          <w:p>
+            <w:pPr>
+              <w:spacing w:after="0"/>
+            </w:pPr>
+            <w:r>
+              <w:rPr>
+                <w:rFonts w:ascii="Malgun Gothic" w:hAnsi="Malgun Gothic"/>
+                <w:sz w:val="20"/>
+              </w:rPr>
+            </w:r>
+            <w:r>
+              <w:rPr>
+                <w:rFonts w:ascii="Malgun Gothic" w:hAnsi="Malgun Gothic"/>
+                <w:b w:val="0"/>
+                <w:sz w:val="20"/>
+              </w:rPr>
+              <w:t>https://github.com/charmbracelet/bubbletea</w:t>
+            </w:r>
+          </w:p>
+        </w:tc>
+        <w:tc>
+          <w:tcPr>
+            <w:tcW w:type="dxa" w:w="4449"/>
+          </w:tcPr>
+          <w:p>
+            <w:pPr>
+              <w:spacing w:after="0"/>
+            </w:pPr>
+            <w:r>
+              <w:rPr>
+                <w:rFonts w:ascii="Malgun Gothic" w:hAnsi="Malgun Gothic"/>
+                <w:sz w:val="20"/>
+              </w:rPr>
+            </w:r>
+            <w:r>
+              <w:rPr>
+                <w:rFonts w:ascii="Malgun Gothic" w:hAnsi="Malgun Gothic"/>
+                <w:b w:val="0"/>
+                <w:sz w:val="20"/>
+              </w:rPr>
+              <w:t>runtime: Terminal UI runtime for FMON.</w:t>
+            </w:r>
+          </w:p>
+        </w:tc>
+      </w:tr>
+      <w:tr>
+        <w:tc>
+          <w:tcPr>
+            <w:tcW w:type="dxa" w:w="768"/>
+          </w:tcPr>
+          <w:p>
+            <w:pPr>
+              <w:spacing w:after="0"/>
+            </w:pPr>
+            <w:r>
+              <w:rPr>
+                <w:rFonts w:ascii="Malgun Gothic" w:hAnsi="Malgun Gothic"/>
+                <w:sz w:val="20"/>
+              </w:rPr>
+            </w:r>
+            <w:r>
+              <w:rPr>
+                <w:rFonts w:ascii="Malgun Gothic" w:hAnsi="Malgun Gothic"/>
+                <w:b w:val="0"/>
+                <w:sz w:val="20"/>
+              </w:rPr>
+              <w:t>16</w:t>
+            </w:r>
+          </w:p>
+        </w:tc>
+        <w:tc>
+          <w:tcPr>
+            <w:tcW w:type="dxa" w:w="1878"/>
+          </w:tcPr>
+          <w:p>
+            <w:pPr>
+              <w:spacing w:after="0"/>
+            </w:pPr>
+            <w:r>
+              <w:rPr>
+                <w:rFonts w:ascii="Malgun Gothic" w:hAnsi="Malgun Gothic"/>
+                <w:sz w:val="20"/>
+              </w:rPr>
+            </w:r>
+            <w:r>
+              <w:rPr>
+                <w:rFonts w:ascii="Malgun Gothic" w:hAnsi="Malgun Gothic"/>
+                <w:b w:val="0"/>
+                <w:sz w:val="20"/>
+              </w:rPr>
+              <w:t>github.com/charmbracelet/lipgloss</w:t>
+            </w:r>
+          </w:p>
+        </w:tc>
+        <w:tc>
+          <w:tcPr>
+            <w:tcW w:type="dxa" w:w="1387"/>
+          </w:tcPr>
+          <w:p>
+            <w:pPr>
+              <w:spacing w:after="0"/>
+            </w:pPr>
+            <w:r>
+              <w:rPr>
+                <w:rFonts w:ascii="Malgun Gothic" w:hAnsi="Malgun Gothic"/>
+                <w:sz w:val="20"/>
+              </w:rPr>
+            </w:r>
+            <w:r>
+              <w:rPr>
+                <w:rFonts w:ascii="Malgun Gothic" w:hAnsi="Malgun Gothic"/>
+                <w:b w:val="0"/>
+                <w:sz w:val="20"/>
+              </w:rPr>
+              <w:t>v1.0.0</w:t>
+            </w:r>
+          </w:p>
+        </w:tc>
+        <w:tc>
+          <w:tcPr>
+            <w:tcW w:type="dxa" w:w="1495"/>
+          </w:tcPr>
+          <w:p>
+            <w:pPr>
+              <w:spacing w:after="0"/>
+            </w:pPr>
+            <w:r>
+              <w:rPr>
+                <w:rFonts w:ascii="Malgun Gothic" w:hAnsi="Malgun Gothic"/>
+                <w:sz w:val="20"/>
+              </w:rPr>
+            </w:r>
+            <w:r>
+              <w:rPr>
+                <w:rFonts w:ascii="Malgun Gothic" w:hAnsi="Malgun Gothic"/>
+                <w:b w:val="0"/>
+                <w:sz w:val="20"/>
+              </w:rPr>
+              <w:t>MIT</w:t>
+            </w:r>
+          </w:p>
+        </w:tc>
+        <w:tc>
+          <w:tcPr>
+            <w:tcW w:type="dxa" w:w="4536"/>
+          </w:tcPr>
+          <w:p>
+            <w:pPr>
+              <w:spacing w:after="0"/>
+            </w:pPr>
+            <w:r>
+              <w:rPr>
+                <w:rFonts w:ascii="Malgun Gothic" w:hAnsi="Malgun Gothic"/>
+                <w:sz w:val="20"/>
+              </w:rPr>
+            </w:r>
+            <w:r>
+              <w:rPr>
+                <w:rFonts w:ascii="Malgun Gothic" w:hAnsi="Malgun Gothic"/>
+                <w:b w:val="0"/>
+                <w:sz w:val="20"/>
+              </w:rPr>
               <w:t>https://github.com/charmbracelet/lipgloss</w:t>
             </w:r>
           </w:p>
@@ -4495,7 +5237,2051 @@
                 <w:b w:val="0"/>
                 <w:sz w:val="20"/>
               </w:rPr>
-              <w:t>FMON terminal styling</w:t>
+              <w:t>runtime: Terminal layout and styling for FMON.</w:t>
+            </w:r>
+          </w:p>
+        </w:tc>
+      </w:tr>
+      <w:tr>
+        <w:tc>
+          <w:tcPr>
+            <w:tcW w:type="dxa" w:w="768"/>
+          </w:tcPr>
+          <w:p>
+            <w:pPr>
+              <w:spacing w:after="0"/>
+            </w:pPr>
+            <w:r>
+              <w:rPr>
+                <w:rFonts w:ascii="Malgun Gothic" w:hAnsi="Malgun Gothic"/>
+                <w:sz w:val="20"/>
+              </w:rPr>
+            </w:r>
+            <w:r>
+              <w:rPr>
+                <w:rFonts w:ascii="Malgun Gothic" w:hAnsi="Malgun Gothic"/>
+                <w:b w:val="0"/>
+                <w:sz w:val="20"/>
+              </w:rPr>
+              <w:t>17</w:t>
+            </w:r>
+          </w:p>
+        </w:tc>
+        <w:tc>
+          <w:tcPr>
+            <w:tcW w:type="dxa" w:w="1878"/>
+          </w:tcPr>
+          <w:p>
+            <w:pPr>
+              <w:spacing w:after="0"/>
+            </w:pPr>
+            <w:r>
+              <w:rPr>
+                <w:rFonts w:ascii="Malgun Gothic" w:hAnsi="Malgun Gothic"/>
+                <w:sz w:val="20"/>
+              </w:rPr>
+            </w:r>
+            <w:r>
+              <w:rPr>
+                <w:rFonts w:ascii="Malgun Gothic" w:hAnsi="Malgun Gothic"/>
+                <w:b w:val="0"/>
+                <w:sz w:val="20"/>
+              </w:rPr>
+              <w:t>github.com/charmbracelet/x/ansi</w:t>
+            </w:r>
+          </w:p>
+        </w:tc>
+        <w:tc>
+          <w:tcPr>
+            <w:tcW w:type="dxa" w:w="1387"/>
+          </w:tcPr>
+          <w:p>
+            <w:pPr>
+              <w:spacing w:after="0"/>
+            </w:pPr>
+            <w:r>
+              <w:rPr>
+                <w:rFonts w:ascii="Malgun Gothic" w:hAnsi="Malgun Gothic"/>
+                <w:sz w:val="20"/>
+              </w:rPr>
+            </w:r>
+            <w:r>
+              <w:rPr>
+                <w:rFonts w:ascii="Malgun Gothic" w:hAnsi="Malgun Gothic"/>
+                <w:b w:val="0"/>
+                <w:sz w:val="20"/>
+              </w:rPr>
+              <w:t>v0.8.0</w:t>
+            </w:r>
+          </w:p>
+        </w:tc>
+        <w:tc>
+          <w:tcPr>
+            <w:tcW w:type="dxa" w:w="1495"/>
+          </w:tcPr>
+          <w:p>
+            <w:pPr>
+              <w:spacing w:after="0"/>
+            </w:pPr>
+            <w:r>
+              <w:rPr>
+                <w:rFonts w:ascii="Malgun Gothic" w:hAnsi="Malgun Gothic"/>
+                <w:sz w:val="20"/>
+              </w:rPr>
+            </w:r>
+            <w:r>
+              <w:rPr>
+                <w:rFonts w:ascii="Malgun Gothic" w:hAnsi="Malgun Gothic"/>
+                <w:b w:val="0"/>
+                <w:sz w:val="20"/>
+              </w:rPr>
+              <w:t>MIT</w:t>
+            </w:r>
+          </w:p>
+        </w:tc>
+        <w:tc>
+          <w:tcPr>
+            <w:tcW w:type="dxa" w:w="4536"/>
+          </w:tcPr>
+          <w:p>
+            <w:pPr>
+              <w:spacing w:after="0"/>
+            </w:pPr>
+            <w:r>
+              <w:rPr>
+                <w:rFonts w:ascii="Malgun Gothic" w:hAnsi="Malgun Gothic"/>
+                <w:sz w:val="20"/>
+              </w:rPr>
+            </w:r>
+            <w:r>
+              <w:rPr>
+                <w:rFonts w:ascii="Malgun Gothic" w:hAnsi="Malgun Gothic"/>
+                <w:b w:val="0"/>
+                <w:sz w:val="20"/>
+              </w:rPr>
+              <w:t>https://github.com/charmbracelet/x</w:t>
+            </w:r>
+          </w:p>
+        </w:tc>
+        <w:tc>
+          <w:tcPr>
+            <w:tcW w:type="dxa" w:w="4449"/>
+          </w:tcPr>
+          <w:p>
+            <w:pPr>
+              <w:spacing w:after="0"/>
+            </w:pPr>
+            <w:r>
+              <w:rPr>
+                <w:rFonts w:ascii="Malgun Gothic" w:hAnsi="Malgun Gothic"/>
+                <w:sz w:val="20"/>
+              </w:rPr>
+            </w:r>
+            <w:r>
+              <w:rPr>
+                <w:rFonts w:ascii="Malgun Gothic" w:hAnsi="Malgun Gothic"/>
+                <w:b w:val="0"/>
+                <w:sz w:val="20"/>
+              </w:rPr>
+              <w:t>indirect: Transitive terminal/runtime support for the FMON local TUI.</w:t>
+            </w:r>
+          </w:p>
+        </w:tc>
+      </w:tr>
+      <w:tr>
+        <w:tc>
+          <w:tcPr>
+            <w:tcW w:type="dxa" w:w="768"/>
+          </w:tcPr>
+          <w:p>
+            <w:pPr>
+              <w:spacing w:after="0"/>
+            </w:pPr>
+            <w:r>
+              <w:rPr>
+                <w:rFonts w:ascii="Malgun Gothic" w:hAnsi="Malgun Gothic"/>
+                <w:sz w:val="20"/>
+              </w:rPr>
+            </w:r>
+            <w:r>
+              <w:rPr>
+                <w:rFonts w:ascii="Malgun Gothic" w:hAnsi="Malgun Gothic"/>
+                <w:b w:val="0"/>
+                <w:sz w:val="20"/>
+              </w:rPr>
+              <w:t>18</w:t>
+            </w:r>
+          </w:p>
+        </w:tc>
+        <w:tc>
+          <w:tcPr>
+            <w:tcW w:type="dxa" w:w="1878"/>
+          </w:tcPr>
+          <w:p>
+            <w:pPr>
+              <w:spacing w:after="0"/>
+            </w:pPr>
+            <w:r>
+              <w:rPr>
+                <w:rFonts w:ascii="Malgun Gothic" w:hAnsi="Malgun Gothic"/>
+                <w:sz w:val="20"/>
+              </w:rPr>
+            </w:r>
+            <w:r>
+              <w:rPr>
+                <w:rFonts w:ascii="Malgun Gothic" w:hAnsi="Malgun Gothic"/>
+                <w:b w:val="0"/>
+                <w:sz w:val="20"/>
+              </w:rPr>
+              <w:t>github.com/charmbracelet/x/term</w:t>
+            </w:r>
+          </w:p>
+        </w:tc>
+        <w:tc>
+          <w:tcPr>
+            <w:tcW w:type="dxa" w:w="1387"/>
+          </w:tcPr>
+          <w:p>
+            <w:pPr>
+              <w:spacing w:after="0"/>
+            </w:pPr>
+            <w:r>
+              <w:rPr>
+                <w:rFonts w:ascii="Malgun Gothic" w:hAnsi="Malgun Gothic"/>
+                <w:sz w:val="20"/>
+              </w:rPr>
+            </w:r>
+            <w:r>
+              <w:rPr>
+                <w:rFonts w:ascii="Malgun Gothic" w:hAnsi="Malgun Gothic"/>
+                <w:b w:val="0"/>
+                <w:sz w:val="20"/>
+              </w:rPr>
+              <w:t>v0.2.1</w:t>
+            </w:r>
+          </w:p>
+        </w:tc>
+        <w:tc>
+          <w:tcPr>
+            <w:tcW w:type="dxa" w:w="1495"/>
+          </w:tcPr>
+          <w:p>
+            <w:pPr>
+              <w:spacing w:after="0"/>
+            </w:pPr>
+            <w:r>
+              <w:rPr>
+                <w:rFonts w:ascii="Malgun Gothic" w:hAnsi="Malgun Gothic"/>
+                <w:sz w:val="20"/>
+              </w:rPr>
+            </w:r>
+            <w:r>
+              <w:rPr>
+                <w:rFonts w:ascii="Malgun Gothic" w:hAnsi="Malgun Gothic"/>
+                <w:b w:val="0"/>
+                <w:sz w:val="20"/>
+              </w:rPr>
+              <w:t>MIT</w:t>
+            </w:r>
+          </w:p>
+        </w:tc>
+        <w:tc>
+          <w:tcPr>
+            <w:tcW w:type="dxa" w:w="4536"/>
+          </w:tcPr>
+          <w:p>
+            <w:pPr>
+              <w:spacing w:after="0"/>
+            </w:pPr>
+            <w:r>
+              <w:rPr>
+                <w:rFonts w:ascii="Malgun Gothic" w:hAnsi="Malgun Gothic"/>
+                <w:sz w:val="20"/>
+              </w:rPr>
+            </w:r>
+            <w:r>
+              <w:rPr>
+                <w:rFonts w:ascii="Malgun Gothic" w:hAnsi="Malgun Gothic"/>
+                <w:b w:val="0"/>
+                <w:sz w:val="20"/>
+              </w:rPr>
+              <w:t>https://github.com/charmbracelet/x</w:t>
+            </w:r>
+          </w:p>
+        </w:tc>
+        <w:tc>
+          <w:tcPr>
+            <w:tcW w:type="dxa" w:w="4449"/>
+          </w:tcPr>
+          <w:p>
+            <w:pPr>
+              <w:spacing w:after="0"/>
+            </w:pPr>
+            <w:r>
+              <w:rPr>
+                <w:rFonts w:ascii="Malgun Gothic" w:hAnsi="Malgun Gothic"/>
+                <w:sz w:val="20"/>
+              </w:rPr>
+            </w:r>
+            <w:r>
+              <w:rPr>
+                <w:rFonts w:ascii="Malgun Gothic" w:hAnsi="Malgun Gothic"/>
+                <w:b w:val="0"/>
+                <w:sz w:val="20"/>
+              </w:rPr>
+              <w:t>indirect: Transitive terminal/runtime support for the FMON local TUI.</w:t>
+            </w:r>
+          </w:p>
+        </w:tc>
+      </w:tr>
+      <w:tr>
+        <w:tc>
+          <w:tcPr>
+            <w:tcW w:type="dxa" w:w="768"/>
+          </w:tcPr>
+          <w:p>
+            <w:pPr>
+              <w:spacing w:after="0"/>
+            </w:pPr>
+            <w:r>
+              <w:rPr>
+                <w:rFonts w:ascii="Malgun Gothic" w:hAnsi="Malgun Gothic"/>
+                <w:sz w:val="20"/>
+              </w:rPr>
+            </w:r>
+            <w:r>
+              <w:rPr>
+                <w:rFonts w:ascii="Malgun Gothic" w:hAnsi="Malgun Gothic"/>
+                <w:b w:val="0"/>
+                <w:sz w:val="20"/>
+              </w:rPr>
+              <w:t>19</w:t>
+            </w:r>
+          </w:p>
+        </w:tc>
+        <w:tc>
+          <w:tcPr>
+            <w:tcW w:type="dxa" w:w="1878"/>
+          </w:tcPr>
+          <w:p>
+            <w:pPr>
+              <w:spacing w:after="0"/>
+            </w:pPr>
+            <w:r>
+              <w:rPr>
+                <w:rFonts w:ascii="Malgun Gothic" w:hAnsi="Malgun Gothic"/>
+                <w:sz w:val="20"/>
+              </w:rPr>
+            </w:r>
+            <w:r>
+              <w:rPr>
+                <w:rFonts w:ascii="Malgun Gothic" w:hAnsi="Malgun Gothic"/>
+                <w:b w:val="0"/>
+                <w:sz w:val="20"/>
+              </w:rPr>
+              <w:t>github.com/erikgeiser/coninput</w:t>
+            </w:r>
+          </w:p>
+        </w:tc>
+        <w:tc>
+          <w:tcPr>
+            <w:tcW w:type="dxa" w:w="1387"/>
+          </w:tcPr>
+          <w:p>
+            <w:pPr>
+              <w:spacing w:after="0"/>
+            </w:pPr>
+            <w:r>
+              <w:rPr>
+                <w:rFonts w:ascii="Malgun Gothic" w:hAnsi="Malgun Gothic"/>
+                <w:sz w:val="20"/>
+              </w:rPr>
+            </w:r>
+            <w:r>
+              <w:rPr>
+                <w:rFonts w:ascii="Malgun Gothic" w:hAnsi="Malgun Gothic"/>
+                <w:b w:val="0"/>
+                <w:sz w:val="20"/>
+              </w:rPr>
+              <w:t>v0.0.0-20211004153227-1c3628e74d0f</w:t>
+            </w:r>
+          </w:p>
+        </w:tc>
+        <w:tc>
+          <w:tcPr>
+            <w:tcW w:type="dxa" w:w="1495"/>
+          </w:tcPr>
+          <w:p>
+            <w:pPr>
+              <w:spacing w:after="0"/>
+            </w:pPr>
+            <w:r>
+              <w:rPr>
+                <w:rFonts w:ascii="Malgun Gothic" w:hAnsi="Malgun Gothic"/>
+                <w:sz w:val="20"/>
+              </w:rPr>
+            </w:r>
+            <w:r>
+              <w:rPr>
+                <w:rFonts w:ascii="Malgun Gothic" w:hAnsi="Malgun Gothic"/>
+                <w:b w:val="0"/>
+                <w:sz w:val="20"/>
+              </w:rPr>
+              <w:t>MIT</w:t>
+            </w:r>
+          </w:p>
+        </w:tc>
+        <w:tc>
+          <w:tcPr>
+            <w:tcW w:type="dxa" w:w="4536"/>
+          </w:tcPr>
+          <w:p>
+            <w:pPr>
+              <w:spacing w:after="0"/>
+            </w:pPr>
+            <w:r>
+              <w:rPr>
+                <w:rFonts w:ascii="Malgun Gothic" w:hAnsi="Malgun Gothic"/>
+                <w:sz w:val="20"/>
+              </w:rPr>
+            </w:r>
+            <w:r>
+              <w:rPr>
+                <w:rFonts w:ascii="Malgun Gothic" w:hAnsi="Malgun Gothic"/>
+                <w:b w:val="0"/>
+                <w:sz w:val="20"/>
+              </w:rPr>
+              <w:t>https://github.com/erikgeiser/coninput</w:t>
+            </w:r>
+          </w:p>
+        </w:tc>
+        <w:tc>
+          <w:tcPr>
+            <w:tcW w:type="dxa" w:w="4449"/>
+          </w:tcPr>
+          <w:p>
+            <w:pPr>
+              <w:spacing w:after="0"/>
+            </w:pPr>
+            <w:r>
+              <w:rPr>
+                <w:rFonts w:ascii="Malgun Gothic" w:hAnsi="Malgun Gothic"/>
+                <w:sz w:val="20"/>
+              </w:rPr>
+            </w:r>
+            <w:r>
+              <w:rPr>
+                <w:rFonts w:ascii="Malgun Gothic" w:hAnsi="Malgun Gothic"/>
+                <w:b w:val="0"/>
+                <w:sz w:val="20"/>
+              </w:rPr>
+              <w:t>indirect: Transitive terminal/runtime support for the FMON local TUI.</w:t>
+            </w:r>
+          </w:p>
+        </w:tc>
+      </w:tr>
+      <w:tr>
+        <w:tc>
+          <w:tcPr>
+            <w:tcW w:type="dxa" w:w="768"/>
+          </w:tcPr>
+          <w:p>
+            <w:pPr>
+              <w:spacing w:after="0"/>
+            </w:pPr>
+            <w:r>
+              <w:rPr>
+                <w:rFonts w:ascii="Malgun Gothic" w:hAnsi="Malgun Gothic"/>
+                <w:sz w:val="20"/>
+              </w:rPr>
+            </w:r>
+            <w:r>
+              <w:rPr>
+                <w:rFonts w:ascii="Malgun Gothic" w:hAnsi="Malgun Gothic"/>
+                <w:b w:val="0"/>
+                <w:sz w:val="20"/>
+              </w:rPr>
+              <w:t>20</w:t>
+            </w:r>
+          </w:p>
+        </w:tc>
+        <w:tc>
+          <w:tcPr>
+            <w:tcW w:type="dxa" w:w="1878"/>
+          </w:tcPr>
+          <w:p>
+            <w:pPr>
+              <w:spacing w:after="0"/>
+            </w:pPr>
+            <w:r>
+              <w:rPr>
+                <w:rFonts w:ascii="Malgun Gothic" w:hAnsi="Malgun Gothic"/>
+                <w:sz w:val="20"/>
+              </w:rPr>
+            </w:r>
+            <w:r>
+              <w:rPr>
+                <w:rFonts w:ascii="Malgun Gothic" w:hAnsi="Malgun Gothic"/>
+                <w:b w:val="0"/>
+                <w:sz w:val="20"/>
+              </w:rPr>
+              <w:t>github.com/lucasb-eyer/go-colorful</w:t>
+            </w:r>
+          </w:p>
+        </w:tc>
+        <w:tc>
+          <w:tcPr>
+            <w:tcW w:type="dxa" w:w="1387"/>
+          </w:tcPr>
+          <w:p>
+            <w:pPr>
+              <w:spacing w:after="0"/>
+            </w:pPr>
+            <w:r>
+              <w:rPr>
+                <w:rFonts w:ascii="Malgun Gothic" w:hAnsi="Malgun Gothic"/>
+                <w:sz w:val="20"/>
+              </w:rPr>
+            </w:r>
+            <w:r>
+              <w:rPr>
+                <w:rFonts w:ascii="Malgun Gothic" w:hAnsi="Malgun Gothic"/>
+                <w:b w:val="0"/>
+                <w:sz w:val="20"/>
+              </w:rPr>
+              <w:t>v1.2.0</w:t>
+            </w:r>
+          </w:p>
+        </w:tc>
+        <w:tc>
+          <w:tcPr>
+            <w:tcW w:type="dxa" w:w="1495"/>
+          </w:tcPr>
+          <w:p>
+            <w:pPr>
+              <w:spacing w:after="0"/>
+            </w:pPr>
+            <w:r>
+              <w:rPr>
+                <w:rFonts w:ascii="Malgun Gothic" w:hAnsi="Malgun Gothic"/>
+                <w:sz w:val="20"/>
+              </w:rPr>
+            </w:r>
+            <w:r>
+              <w:rPr>
+                <w:rFonts w:ascii="Malgun Gothic" w:hAnsi="Malgun Gothic"/>
+                <w:b w:val="0"/>
+                <w:sz w:val="20"/>
+              </w:rPr>
+              <w:t>MIT</w:t>
+            </w:r>
+          </w:p>
+        </w:tc>
+        <w:tc>
+          <w:tcPr>
+            <w:tcW w:type="dxa" w:w="4536"/>
+          </w:tcPr>
+          <w:p>
+            <w:pPr>
+              <w:spacing w:after="0"/>
+            </w:pPr>
+            <w:r>
+              <w:rPr>
+                <w:rFonts w:ascii="Malgun Gothic" w:hAnsi="Malgun Gothic"/>
+                <w:sz w:val="20"/>
+              </w:rPr>
+            </w:r>
+            <w:r>
+              <w:rPr>
+                <w:rFonts w:ascii="Malgun Gothic" w:hAnsi="Malgun Gothic"/>
+                <w:b w:val="0"/>
+                <w:sz w:val="20"/>
+              </w:rPr>
+              <w:t>https://github.com/lucasb-eyer/go-colorful</w:t>
+            </w:r>
+          </w:p>
+        </w:tc>
+        <w:tc>
+          <w:tcPr>
+            <w:tcW w:type="dxa" w:w="4449"/>
+          </w:tcPr>
+          <w:p>
+            <w:pPr>
+              <w:spacing w:after="0"/>
+            </w:pPr>
+            <w:r>
+              <w:rPr>
+                <w:rFonts w:ascii="Malgun Gothic" w:hAnsi="Malgun Gothic"/>
+                <w:sz w:val="20"/>
+              </w:rPr>
+            </w:r>
+            <w:r>
+              <w:rPr>
+                <w:rFonts w:ascii="Malgun Gothic" w:hAnsi="Malgun Gothic"/>
+                <w:b w:val="0"/>
+                <w:sz w:val="20"/>
+              </w:rPr>
+              <w:t>indirect: Transitive terminal/runtime support for the FMON local TUI.</w:t>
+            </w:r>
+          </w:p>
+        </w:tc>
+      </w:tr>
+      <w:tr>
+        <w:tc>
+          <w:tcPr>
+            <w:tcW w:type="dxa" w:w="768"/>
+          </w:tcPr>
+          <w:p>
+            <w:pPr>
+              <w:spacing w:after="0"/>
+            </w:pPr>
+            <w:r>
+              <w:rPr>
+                <w:rFonts w:ascii="Malgun Gothic" w:hAnsi="Malgun Gothic"/>
+                <w:sz w:val="20"/>
+              </w:rPr>
+            </w:r>
+            <w:r>
+              <w:rPr>
+                <w:rFonts w:ascii="Malgun Gothic" w:hAnsi="Malgun Gothic"/>
+                <w:b w:val="0"/>
+                <w:sz w:val="20"/>
+              </w:rPr>
+              <w:t>21</w:t>
+            </w:r>
+          </w:p>
+        </w:tc>
+        <w:tc>
+          <w:tcPr>
+            <w:tcW w:type="dxa" w:w="1878"/>
+          </w:tcPr>
+          <w:p>
+            <w:pPr>
+              <w:spacing w:after="0"/>
+            </w:pPr>
+            <w:r>
+              <w:rPr>
+                <w:rFonts w:ascii="Malgun Gothic" w:hAnsi="Malgun Gothic"/>
+                <w:sz w:val="20"/>
+              </w:rPr>
+            </w:r>
+            <w:r>
+              <w:rPr>
+                <w:rFonts w:ascii="Malgun Gothic" w:hAnsi="Malgun Gothic"/>
+                <w:b w:val="0"/>
+                <w:sz w:val="20"/>
+              </w:rPr>
+              <w:t>github.com/mattn/go-isatty</w:t>
+            </w:r>
+          </w:p>
+        </w:tc>
+        <w:tc>
+          <w:tcPr>
+            <w:tcW w:type="dxa" w:w="1387"/>
+          </w:tcPr>
+          <w:p>
+            <w:pPr>
+              <w:spacing w:after="0"/>
+            </w:pPr>
+            <w:r>
+              <w:rPr>
+                <w:rFonts w:ascii="Malgun Gothic" w:hAnsi="Malgun Gothic"/>
+                <w:sz w:val="20"/>
+              </w:rPr>
+            </w:r>
+            <w:r>
+              <w:rPr>
+                <w:rFonts w:ascii="Malgun Gothic" w:hAnsi="Malgun Gothic"/>
+                <w:b w:val="0"/>
+                <w:sz w:val="20"/>
+              </w:rPr>
+              <w:t>v0.0.20</w:t>
+            </w:r>
+          </w:p>
+        </w:tc>
+        <w:tc>
+          <w:tcPr>
+            <w:tcW w:type="dxa" w:w="1495"/>
+          </w:tcPr>
+          <w:p>
+            <w:pPr>
+              <w:spacing w:after="0"/>
+            </w:pPr>
+            <w:r>
+              <w:rPr>
+                <w:rFonts w:ascii="Malgun Gothic" w:hAnsi="Malgun Gothic"/>
+                <w:sz w:val="20"/>
+              </w:rPr>
+            </w:r>
+            <w:r>
+              <w:rPr>
+                <w:rFonts w:ascii="Malgun Gothic" w:hAnsi="Malgun Gothic"/>
+                <w:b w:val="0"/>
+                <w:sz w:val="20"/>
+              </w:rPr>
+              <w:t>MIT</w:t>
+            </w:r>
+          </w:p>
+        </w:tc>
+        <w:tc>
+          <w:tcPr>
+            <w:tcW w:type="dxa" w:w="4536"/>
+          </w:tcPr>
+          <w:p>
+            <w:pPr>
+              <w:spacing w:after="0"/>
+            </w:pPr>
+            <w:r>
+              <w:rPr>
+                <w:rFonts w:ascii="Malgun Gothic" w:hAnsi="Malgun Gothic"/>
+                <w:sz w:val="20"/>
+              </w:rPr>
+            </w:r>
+            <w:r>
+              <w:rPr>
+                <w:rFonts w:ascii="Malgun Gothic" w:hAnsi="Malgun Gothic"/>
+                <w:b w:val="0"/>
+                <w:sz w:val="20"/>
+              </w:rPr>
+              <w:t>https://github.com/mattn/go-isatty</w:t>
+            </w:r>
+          </w:p>
+        </w:tc>
+        <w:tc>
+          <w:tcPr>
+            <w:tcW w:type="dxa" w:w="4449"/>
+          </w:tcPr>
+          <w:p>
+            <w:pPr>
+              <w:spacing w:after="0"/>
+            </w:pPr>
+            <w:r>
+              <w:rPr>
+                <w:rFonts w:ascii="Malgun Gothic" w:hAnsi="Malgun Gothic"/>
+                <w:sz w:val="20"/>
+              </w:rPr>
+            </w:r>
+            <w:r>
+              <w:rPr>
+                <w:rFonts w:ascii="Malgun Gothic" w:hAnsi="Malgun Gothic"/>
+                <w:b w:val="0"/>
+                <w:sz w:val="20"/>
+              </w:rPr>
+              <w:t>indirect: Transitive terminal/runtime support for the FMON local TUI.</w:t>
+            </w:r>
+          </w:p>
+        </w:tc>
+      </w:tr>
+      <w:tr>
+        <w:tc>
+          <w:tcPr>
+            <w:tcW w:type="dxa" w:w="768"/>
+          </w:tcPr>
+          <w:p>
+            <w:pPr>
+              <w:spacing w:after="0"/>
+            </w:pPr>
+            <w:r>
+              <w:rPr>
+                <w:rFonts w:ascii="Malgun Gothic" w:hAnsi="Malgun Gothic"/>
+                <w:sz w:val="20"/>
+              </w:rPr>
+            </w:r>
+            <w:r>
+              <w:rPr>
+                <w:rFonts w:ascii="Malgun Gothic" w:hAnsi="Malgun Gothic"/>
+                <w:b w:val="0"/>
+                <w:sz w:val="20"/>
+              </w:rPr>
+              <w:t>22</w:t>
+            </w:r>
+          </w:p>
+        </w:tc>
+        <w:tc>
+          <w:tcPr>
+            <w:tcW w:type="dxa" w:w="1878"/>
+          </w:tcPr>
+          <w:p>
+            <w:pPr>
+              <w:spacing w:after="0"/>
+            </w:pPr>
+            <w:r>
+              <w:rPr>
+                <w:rFonts w:ascii="Malgun Gothic" w:hAnsi="Malgun Gothic"/>
+                <w:sz w:val="20"/>
+              </w:rPr>
+            </w:r>
+            <w:r>
+              <w:rPr>
+                <w:rFonts w:ascii="Malgun Gothic" w:hAnsi="Malgun Gothic"/>
+                <w:b w:val="0"/>
+                <w:sz w:val="20"/>
+              </w:rPr>
+              <w:t>github.com/mattn/go-localereader</w:t>
+            </w:r>
+          </w:p>
+        </w:tc>
+        <w:tc>
+          <w:tcPr>
+            <w:tcW w:type="dxa" w:w="1387"/>
+          </w:tcPr>
+          <w:p>
+            <w:pPr>
+              <w:spacing w:after="0"/>
+            </w:pPr>
+            <w:r>
+              <w:rPr>
+                <w:rFonts w:ascii="Malgun Gothic" w:hAnsi="Malgun Gothic"/>
+                <w:sz w:val="20"/>
+              </w:rPr>
+            </w:r>
+            <w:r>
+              <w:rPr>
+                <w:rFonts w:ascii="Malgun Gothic" w:hAnsi="Malgun Gothic"/>
+                <w:b w:val="0"/>
+                <w:sz w:val="20"/>
+              </w:rPr>
+              <w:t>v0.0.1</w:t>
+            </w:r>
+          </w:p>
+        </w:tc>
+        <w:tc>
+          <w:tcPr>
+            <w:tcW w:type="dxa" w:w="1495"/>
+          </w:tcPr>
+          <w:p>
+            <w:pPr>
+              <w:spacing w:after="0"/>
+            </w:pPr>
+            <w:r>
+              <w:rPr>
+                <w:rFonts w:ascii="Malgun Gothic" w:hAnsi="Malgun Gothic"/>
+                <w:sz w:val="20"/>
+              </w:rPr>
+            </w:r>
+            <w:r>
+              <w:rPr>
+                <w:rFonts w:ascii="Malgun Gothic" w:hAnsi="Malgun Gothic"/>
+                <w:b w:val="0"/>
+                <w:sz w:val="20"/>
+              </w:rPr>
+              <w:t>MIT</w:t>
+            </w:r>
+          </w:p>
+        </w:tc>
+        <w:tc>
+          <w:tcPr>
+            <w:tcW w:type="dxa" w:w="4536"/>
+          </w:tcPr>
+          <w:p>
+            <w:pPr>
+              <w:spacing w:after="0"/>
+            </w:pPr>
+            <w:r>
+              <w:rPr>
+                <w:rFonts w:ascii="Malgun Gothic" w:hAnsi="Malgun Gothic"/>
+                <w:sz w:val="20"/>
+              </w:rPr>
+            </w:r>
+            <w:r>
+              <w:rPr>
+                <w:rFonts w:ascii="Malgun Gothic" w:hAnsi="Malgun Gothic"/>
+                <w:b w:val="0"/>
+                <w:sz w:val="20"/>
+              </w:rPr>
+              <w:t>https://github.com/mattn/go-localereader</w:t>
+            </w:r>
+          </w:p>
+        </w:tc>
+        <w:tc>
+          <w:tcPr>
+            <w:tcW w:type="dxa" w:w="4449"/>
+          </w:tcPr>
+          <w:p>
+            <w:pPr>
+              <w:spacing w:after="0"/>
+            </w:pPr>
+            <w:r>
+              <w:rPr>
+                <w:rFonts w:ascii="Malgun Gothic" w:hAnsi="Malgun Gothic"/>
+                <w:sz w:val="20"/>
+              </w:rPr>
+            </w:r>
+            <w:r>
+              <w:rPr>
+                <w:rFonts w:ascii="Malgun Gothic" w:hAnsi="Malgun Gothic"/>
+                <w:b w:val="0"/>
+                <w:sz w:val="20"/>
+              </w:rPr>
+              <w:t>indirect: Transitive terminal/runtime support for the FMON local TUI.</w:t>
+            </w:r>
+          </w:p>
+        </w:tc>
+      </w:tr>
+      <w:tr>
+        <w:tc>
+          <w:tcPr>
+            <w:tcW w:type="dxa" w:w="768"/>
+          </w:tcPr>
+          <w:p>
+            <w:pPr>
+              <w:spacing w:after="0"/>
+            </w:pPr>
+            <w:r>
+              <w:rPr>
+                <w:rFonts w:ascii="Malgun Gothic" w:hAnsi="Malgun Gothic"/>
+                <w:sz w:val="20"/>
+              </w:rPr>
+            </w:r>
+            <w:r>
+              <w:rPr>
+                <w:rFonts w:ascii="Malgun Gothic" w:hAnsi="Malgun Gothic"/>
+                <w:b w:val="0"/>
+                <w:sz w:val="20"/>
+              </w:rPr>
+              <w:t>23</w:t>
+            </w:r>
+          </w:p>
+        </w:tc>
+        <w:tc>
+          <w:tcPr>
+            <w:tcW w:type="dxa" w:w="1878"/>
+          </w:tcPr>
+          <w:p>
+            <w:pPr>
+              <w:spacing w:after="0"/>
+            </w:pPr>
+            <w:r>
+              <w:rPr>
+                <w:rFonts w:ascii="Malgun Gothic" w:hAnsi="Malgun Gothic"/>
+                <w:sz w:val="20"/>
+              </w:rPr>
+            </w:r>
+            <w:r>
+              <w:rPr>
+                <w:rFonts w:ascii="Malgun Gothic" w:hAnsi="Malgun Gothic"/>
+                <w:b w:val="0"/>
+                <w:sz w:val="20"/>
+              </w:rPr>
+              <w:t>github.com/mattn/go-runewidth</w:t>
+            </w:r>
+          </w:p>
+        </w:tc>
+        <w:tc>
+          <w:tcPr>
+            <w:tcW w:type="dxa" w:w="1387"/>
+          </w:tcPr>
+          <w:p>
+            <w:pPr>
+              <w:spacing w:after="0"/>
+            </w:pPr>
+            <w:r>
+              <w:rPr>
+                <w:rFonts w:ascii="Malgun Gothic" w:hAnsi="Malgun Gothic"/>
+                <w:sz w:val="20"/>
+              </w:rPr>
+            </w:r>
+            <w:r>
+              <w:rPr>
+                <w:rFonts w:ascii="Malgun Gothic" w:hAnsi="Malgun Gothic"/>
+                <w:b w:val="0"/>
+                <w:sz w:val="20"/>
+              </w:rPr>
+              <w:t>v0.0.16</w:t>
+            </w:r>
+          </w:p>
+        </w:tc>
+        <w:tc>
+          <w:tcPr>
+            <w:tcW w:type="dxa" w:w="1495"/>
+          </w:tcPr>
+          <w:p>
+            <w:pPr>
+              <w:spacing w:after="0"/>
+            </w:pPr>
+            <w:r>
+              <w:rPr>
+                <w:rFonts w:ascii="Malgun Gothic" w:hAnsi="Malgun Gothic"/>
+                <w:sz w:val="20"/>
+              </w:rPr>
+            </w:r>
+            <w:r>
+              <w:rPr>
+                <w:rFonts w:ascii="Malgun Gothic" w:hAnsi="Malgun Gothic"/>
+                <w:b w:val="0"/>
+                <w:sz w:val="20"/>
+              </w:rPr>
+              <w:t>MIT</w:t>
+            </w:r>
+          </w:p>
+        </w:tc>
+        <w:tc>
+          <w:tcPr>
+            <w:tcW w:type="dxa" w:w="4536"/>
+          </w:tcPr>
+          <w:p>
+            <w:pPr>
+              <w:spacing w:after="0"/>
+            </w:pPr>
+            <w:r>
+              <w:rPr>
+                <w:rFonts w:ascii="Malgun Gothic" w:hAnsi="Malgun Gothic"/>
+                <w:sz w:val="20"/>
+              </w:rPr>
+            </w:r>
+            <w:r>
+              <w:rPr>
+                <w:rFonts w:ascii="Malgun Gothic" w:hAnsi="Malgun Gothic"/>
+                <w:b w:val="0"/>
+                <w:sz w:val="20"/>
+              </w:rPr>
+              <w:t>https://github.com/mattn/go-runewidth</w:t>
+            </w:r>
+          </w:p>
+        </w:tc>
+        <w:tc>
+          <w:tcPr>
+            <w:tcW w:type="dxa" w:w="4449"/>
+          </w:tcPr>
+          <w:p>
+            <w:pPr>
+              <w:spacing w:after="0"/>
+            </w:pPr>
+            <w:r>
+              <w:rPr>
+                <w:rFonts w:ascii="Malgun Gothic" w:hAnsi="Malgun Gothic"/>
+                <w:sz w:val="20"/>
+              </w:rPr>
+            </w:r>
+            <w:r>
+              <w:rPr>
+                <w:rFonts w:ascii="Malgun Gothic" w:hAnsi="Malgun Gothic"/>
+                <w:b w:val="0"/>
+                <w:sz w:val="20"/>
+              </w:rPr>
+              <w:t>indirect: Transitive terminal/runtime support for the FMON local TUI.</w:t>
+            </w:r>
+          </w:p>
+        </w:tc>
+      </w:tr>
+      <w:tr>
+        <w:tc>
+          <w:tcPr>
+            <w:tcW w:type="dxa" w:w="768"/>
+          </w:tcPr>
+          <w:p>
+            <w:pPr>
+              <w:spacing w:after="0"/>
+            </w:pPr>
+            <w:r>
+              <w:rPr>
+                <w:rFonts w:ascii="Malgun Gothic" w:hAnsi="Malgun Gothic"/>
+                <w:sz w:val="20"/>
+              </w:rPr>
+            </w:r>
+            <w:r>
+              <w:rPr>
+                <w:rFonts w:ascii="Malgun Gothic" w:hAnsi="Malgun Gothic"/>
+                <w:b w:val="0"/>
+                <w:sz w:val="20"/>
+              </w:rPr>
+              <w:t>24</w:t>
+            </w:r>
+          </w:p>
+        </w:tc>
+        <w:tc>
+          <w:tcPr>
+            <w:tcW w:type="dxa" w:w="1878"/>
+          </w:tcPr>
+          <w:p>
+            <w:pPr>
+              <w:spacing w:after="0"/>
+            </w:pPr>
+            <w:r>
+              <w:rPr>
+                <w:rFonts w:ascii="Malgun Gothic" w:hAnsi="Malgun Gothic"/>
+                <w:sz w:val="20"/>
+              </w:rPr>
+            </w:r>
+            <w:r>
+              <w:rPr>
+                <w:rFonts w:ascii="Malgun Gothic" w:hAnsi="Malgun Gothic"/>
+                <w:b w:val="0"/>
+                <w:sz w:val="20"/>
+              </w:rPr>
+              <w:t>github.com/muesli/ansi</w:t>
+            </w:r>
+          </w:p>
+        </w:tc>
+        <w:tc>
+          <w:tcPr>
+            <w:tcW w:type="dxa" w:w="1387"/>
+          </w:tcPr>
+          <w:p>
+            <w:pPr>
+              <w:spacing w:after="0"/>
+            </w:pPr>
+            <w:r>
+              <w:rPr>
+                <w:rFonts w:ascii="Malgun Gothic" w:hAnsi="Malgun Gothic"/>
+                <w:sz w:val="20"/>
+              </w:rPr>
+            </w:r>
+            <w:r>
+              <w:rPr>
+                <w:rFonts w:ascii="Malgun Gothic" w:hAnsi="Malgun Gothic"/>
+                <w:b w:val="0"/>
+                <w:sz w:val="20"/>
+              </w:rPr>
+              <w:t>v0.0.0-20230316100256-276c6243b2f6</w:t>
+            </w:r>
+          </w:p>
+        </w:tc>
+        <w:tc>
+          <w:tcPr>
+            <w:tcW w:type="dxa" w:w="1495"/>
+          </w:tcPr>
+          <w:p>
+            <w:pPr>
+              <w:spacing w:after="0"/>
+            </w:pPr>
+            <w:r>
+              <w:rPr>
+                <w:rFonts w:ascii="Malgun Gothic" w:hAnsi="Malgun Gothic"/>
+                <w:sz w:val="20"/>
+              </w:rPr>
+            </w:r>
+            <w:r>
+              <w:rPr>
+                <w:rFonts w:ascii="Malgun Gothic" w:hAnsi="Malgun Gothic"/>
+                <w:b w:val="0"/>
+                <w:sz w:val="20"/>
+              </w:rPr>
+              <w:t>MIT</w:t>
+            </w:r>
+          </w:p>
+        </w:tc>
+        <w:tc>
+          <w:tcPr>
+            <w:tcW w:type="dxa" w:w="4536"/>
+          </w:tcPr>
+          <w:p>
+            <w:pPr>
+              <w:spacing w:after="0"/>
+            </w:pPr>
+            <w:r>
+              <w:rPr>
+                <w:rFonts w:ascii="Malgun Gothic" w:hAnsi="Malgun Gothic"/>
+                <w:sz w:val="20"/>
+              </w:rPr>
+            </w:r>
+            <w:r>
+              <w:rPr>
+                <w:rFonts w:ascii="Malgun Gothic" w:hAnsi="Malgun Gothic"/>
+                <w:b w:val="0"/>
+                <w:sz w:val="20"/>
+              </w:rPr>
+              <w:t>https://github.com/muesli/ansi</w:t>
+            </w:r>
+          </w:p>
+        </w:tc>
+        <w:tc>
+          <w:tcPr>
+            <w:tcW w:type="dxa" w:w="4449"/>
+          </w:tcPr>
+          <w:p>
+            <w:pPr>
+              <w:spacing w:after="0"/>
+            </w:pPr>
+            <w:r>
+              <w:rPr>
+                <w:rFonts w:ascii="Malgun Gothic" w:hAnsi="Malgun Gothic"/>
+                <w:sz w:val="20"/>
+              </w:rPr>
+            </w:r>
+            <w:r>
+              <w:rPr>
+                <w:rFonts w:ascii="Malgun Gothic" w:hAnsi="Malgun Gothic"/>
+                <w:b w:val="0"/>
+                <w:sz w:val="20"/>
+              </w:rPr>
+              <w:t>indirect: Transitive terminal/runtime support for the FMON local TUI.</w:t>
+            </w:r>
+          </w:p>
+        </w:tc>
+      </w:tr>
+      <w:tr>
+        <w:tc>
+          <w:tcPr>
+            <w:tcW w:type="dxa" w:w="768"/>
+          </w:tcPr>
+          <w:p>
+            <w:pPr>
+              <w:spacing w:after="0"/>
+            </w:pPr>
+            <w:r>
+              <w:rPr>
+                <w:rFonts w:ascii="Malgun Gothic" w:hAnsi="Malgun Gothic"/>
+                <w:sz w:val="20"/>
+              </w:rPr>
+            </w:r>
+            <w:r>
+              <w:rPr>
+                <w:rFonts w:ascii="Malgun Gothic" w:hAnsi="Malgun Gothic"/>
+                <w:b w:val="0"/>
+                <w:sz w:val="20"/>
+              </w:rPr>
+              <w:t>25</w:t>
+            </w:r>
+          </w:p>
+        </w:tc>
+        <w:tc>
+          <w:tcPr>
+            <w:tcW w:type="dxa" w:w="1878"/>
+          </w:tcPr>
+          <w:p>
+            <w:pPr>
+              <w:spacing w:after="0"/>
+            </w:pPr>
+            <w:r>
+              <w:rPr>
+                <w:rFonts w:ascii="Malgun Gothic" w:hAnsi="Malgun Gothic"/>
+                <w:sz w:val="20"/>
+              </w:rPr>
+            </w:r>
+            <w:r>
+              <w:rPr>
+                <w:rFonts w:ascii="Malgun Gothic" w:hAnsi="Malgun Gothic"/>
+                <w:b w:val="0"/>
+                <w:sz w:val="20"/>
+              </w:rPr>
+              <w:t>github.com/muesli/cancelreader</w:t>
+            </w:r>
+          </w:p>
+        </w:tc>
+        <w:tc>
+          <w:tcPr>
+            <w:tcW w:type="dxa" w:w="1387"/>
+          </w:tcPr>
+          <w:p>
+            <w:pPr>
+              <w:spacing w:after="0"/>
+            </w:pPr>
+            <w:r>
+              <w:rPr>
+                <w:rFonts w:ascii="Malgun Gothic" w:hAnsi="Malgun Gothic"/>
+                <w:sz w:val="20"/>
+              </w:rPr>
+            </w:r>
+            <w:r>
+              <w:rPr>
+                <w:rFonts w:ascii="Malgun Gothic" w:hAnsi="Malgun Gothic"/>
+                <w:b w:val="0"/>
+                <w:sz w:val="20"/>
+              </w:rPr>
+              <w:t>v0.2.2</w:t>
+            </w:r>
+          </w:p>
+        </w:tc>
+        <w:tc>
+          <w:tcPr>
+            <w:tcW w:type="dxa" w:w="1495"/>
+          </w:tcPr>
+          <w:p>
+            <w:pPr>
+              <w:spacing w:after="0"/>
+            </w:pPr>
+            <w:r>
+              <w:rPr>
+                <w:rFonts w:ascii="Malgun Gothic" w:hAnsi="Malgun Gothic"/>
+                <w:sz w:val="20"/>
+              </w:rPr>
+            </w:r>
+            <w:r>
+              <w:rPr>
+                <w:rFonts w:ascii="Malgun Gothic" w:hAnsi="Malgun Gothic"/>
+                <w:b w:val="0"/>
+                <w:sz w:val="20"/>
+              </w:rPr>
+              <w:t>MIT</w:t>
+            </w:r>
+          </w:p>
+        </w:tc>
+        <w:tc>
+          <w:tcPr>
+            <w:tcW w:type="dxa" w:w="4536"/>
+          </w:tcPr>
+          <w:p>
+            <w:pPr>
+              <w:spacing w:after="0"/>
+            </w:pPr>
+            <w:r>
+              <w:rPr>
+                <w:rFonts w:ascii="Malgun Gothic" w:hAnsi="Malgun Gothic"/>
+                <w:sz w:val="20"/>
+              </w:rPr>
+            </w:r>
+            <w:r>
+              <w:rPr>
+                <w:rFonts w:ascii="Malgun Gothic" w:hAnsi="Malgun Gothic"/>
+                <w:b w:val="0"/>
+                <w:sz w:val="20"/>
+              </w:rPr>
+              <w:t>https://github.com/muesli/cancelreader</w:t>
+            </w:r>
+          </w:p>
+        </w:tc>
+        <w:tc>
+          <w:tcPr>
+            <w:tcW w:type="dxa" w:w="4449"/>
+          </w:tcPr>
+          <w:p>
+            <w:pPr>
+              <w:spacing w:after="0"/>
+            </w:pPr>
+            <w:r>
+              <w:rPr>
+                <w:rFonts w:ascii="Malgun Gothic" w:hAnsi="Malgun Gothic"/>
+                <w:sz w:val="20"/>
+              </w:rPr>
+            </w:r>
+            <w:r>
+              <w:rPr>
+                <w:rFonts w:ascii="Malgun Gothic" w:hAnsi="Malgun Gothic"/>
+                <w:b w:val="0"/>
+                <w:sz w:val="20"/>
+              </w:rPr>
+              <w:t>indirect: Transitive terminal/runtime support for the FMON local TUI.</w:t>
+            </w:r>
+          </w:p>
+        </w:tc>
+      </w:tr>
+      <w:tr>
+        <w:tc>
+          <w:tcPr>
+            <w:tcW w:type="dxa" w:w="768"/>
+          </w:tcPr>
+          <w:p>
+            <w:pPr>
+              <w:spacing w:after="0"/>
+            </w:pPr>
+            <w:r>
+              <w:rPr>
+                <w:rFonts w:ascii="Malgun Gothic" w:hAnsi="Malgun Gothic"/>
+                <w:sz w:val="20"/>
+              </w:rPr>
+            </w:r>
+            <w:r>
+              <w:rPr>
+                <w:rFonts w:ascii="Malgun Gothic" w:hAnsi="Malgun Gothic"/>
+                <w:b w:val="0"/>
+                <w:sz w:val="20"/>
+              </w:rPr>
+              <w:t>26</w:t>
+            </w:r>
+          </w:p>
+        </w:tc>
+        <w:tc>
+          <w:tcPr>
+            <w:tcW w:type="dxa" w:w="1878"/>
+          </w:tcPr>
+          <w:p>
+            <w:pPr>
+              <w:spacing w:after="0"/>
+            </w:pPr>
+            <w:r>
+              <w:rPr>
+                <w:rFonts w:ascii="Malgun Gothic" w:hAnsi="Malgun Gothic"/>
+                <w:sz w:val="20"/>
+              </w:rPr>
+            </w:r>
+            <w:r>
+              <w:rPr>
+                <w:rFonts w:ascii="Malgun Gothic" w:hAnsi="Malgun Gothic"/>
+                <w:b w:val="0"/>
+                <w:sz w:val="20"/>
+              </w:rPr>
+              <w:t>github.com/muesli/termenv</w:t>
+            </w:r>
+          </w:p>
+        </w:tc>
+        <w:tc>
+          <w:tcPr>
+            <w:tcW w:type="dxa" w:w="1387"/>
+          </w:tcPr>
+          <w:p>
+            <w:pPr>
+              <w:spacing w:after="0"/>
+            </w:pPr>
+            <w:r>
+              <w:rPr>
+                <w:rFonts w:ascii="Malgun Gothic" w:hAnsi="Malgun Gothic"/>
+                <w:sz w:val="20"/>
+              </w:rPr>
+            </w:r>
+            <w:r>
+              <w:rPr>
+                <w:rFonts w:ascii="Malgun Gothic" w:hAnsi="Malgun Gothic"/>
+                <w:b w:val="0"/>
+                <w:sz w:val="20"/>
+              </w:rPr>
+              <w:t>v0.15.2</w:t>
+            </w:r>
+          </w:p>
+        </w:tc>
+        <w:tc>
+          <w:tcPr>
+            <w:tcW w:type="dxa" w:w="1495"/>
+          </w:tcPr>
+          <w:p>
+            <w:pPr>
+              <w:spacing w:after="0"/>
+            </w:pPr>
+            <w:r>
+              <w:rPr>
+                <w:rFonts w:ascii="Malgun Gothic" w:hAnsi="Malgun Gothic"/>
+                <w:sz w:val="20"/>
+              </w:rPr>
+            </w:r>
+            <w:r>
+              <w:rPr>
+                <w:rFonts w:ascii="Malgun Gothic" w:hAnsi="Malgun Gothic"/>
+                <w:b w:val="0"/>
+                <w:sz w:val="20"/>
+              </w:rPr>
+              <w:t>MIT</w:t>
+            </w:r>
+          </w:p>
+        </w:tc>
+        <w:tc>
+          <w:tcPr>
+            <w:tcW w:type="dxa" w:w="4536"/>
+          </w:tcPr>
+          <w:p>
+            <w:pPr>
+              <w:spacing w:after="0"/>
+            </w:pPr>
+            <w:r>
+              <w:rPr>
+                <w:rFonts w:ascii="Malgun Gothic" w:hAnsi="Malgun Gothic"/>
+                <w:sz w:val="20"/>
+              </w:rPr>
+            </w:r>
+            <w:r>
+              <w:rPr>
+                <w:rFonts w:ascii="Malgun Gothic" w:hAnsi="Malgun Gothic"/>
+                <w:b w:val="0"/>
+                <w:sz w:val="20"/>
+              </w:rPr>
+              <w:t>https://github.com/muesli/termenv</w:t>
+            </w:r>
+          </w:p>
+        </w:tc>
+        <w:tc>
+          <w:tcPr>
+            <w:tcW w:type="dxa" w:w="4449"/>
+          </w:tcPr>
+          <w:p>
+            <w:pPr>
+              <w:spacing w:after="0"/>
+            </w:pPr>
+            <w:r>
+              <w:rPr>
+                <w:rFonts w:ascii="Malgun Gothic" w:hAnsi="Malgun Gothic"/>
+                <w:sz w:val="20"/>
+              </w:rPr>
+            </w:r>
+            <w:r>
+              <w:rPr>
+                <w:rFonts w:ascii="Malgun Gothic" w:hAnsi="Malgun Gothic"/>
+                <w:b w:val="0"/>
+                <w:sz w:val="20"/>
+              </w:rPr>
+              <w:t>indirect: Transitive terminal/runtime support for the FMON local TUI.</w:t>
+            </w:r>
+          </w:p>
+        </w:tc>
+      </w:tr>
+      <w:tr>
+        <w:tc>
+          <w:tcPr>
+            <w:tcW w:type="dxa" w:w="768"/>
+          </w:tcPr>
+          <w:p>
+            <w:pPr>
+              <w:spacing w:after="0"/>
+            </w:pPr>
+            <w:r>
+              <w:rPr>
+                <w:rFonts w:ascii="Malgun Gothic" w:hAnsi="Malgun Gothic"/>
+                <w:sz w:val="20"/>
+              </w:rPr>
+            </w:r>
+            <w:r>
+              <w:rPr>
+                <w:rFonts w:ascii="Malgun Gothic" w:hAnsi="Malgun Gothic"/>
+                <w:b w:val="0"/>
+                <w:sz w:val="20"/>
+              </w:rPr>
+              <w:t>27</w:t>
+            </w:r>
+          </w:p>
+        </w:tc>
+        <w:tc>
+          <w:tcPr>
+            <w:tcW w:type="dxa" w:w="1878"/>
+          </w:tcPr>
+          <w:p>
+            <w:pPr>
+              <w:spacing w:after="0"/>
+            </w:pPr>
+            <w:r>
+              <w:rPr>
+                <w:rFonts w:ascii="Malgun Gothic" w:hAnsi="Malgun Gothic"/>
+                <w:sz w:val="20"/>
+              </w:rPr>
+            </w:r>
+            <w:r>
+              <w:rPr>
+                <w:rFonts w:ascii="Malgun Gothic" w:hAnsi="Malgun Gothic"/>
+                <w:b w:val="0"/>
+                <w:sz w:val="20"/>
+              </w:rPr>
+              <w:t>github.com/rivo/uniseg</w:t>
+            </w:r>
+          </w:p>
+        </w:tc>
+        <w:tc>
+          <w:tcPr>
+            <w:tcW w:type="dxa" w:w="1387"/>
+          </w:tcPr>
+          <w:p>
+            <w:pPr>
+              <w:spacing w:after="0"/>
+            </w:pPr>
+            <w:r>
+              <w:rPr>
+                <w:rFonts w:ascii="Malgun Gothic" w:hAnsi="Malgun Gothic"/>
+                <w:sz w:val="20"/>
+              </w:rPr>
+            </w:r>
+            <w:r>
+              <w:rPr>
+                <w:rFonts w:ascii="Malgun Gothic" w:hAnsi="Malgun Gothic"/>
+                <w:b w:val="0"/>
+                <w:sz w:val="20"/>
+              </w:rPr>
+              <w:t>v0.4.7</w:t>
+            </w:r>
+          </w:p>
+        </w:tc>
+        <w:tc>
+          <w:tcPr>
+            <w:tcW w:type="dxa" w:w="1495"/>
+          </w:tcPr>
+          <w:p>
+            <w:pPr>
+              <w:spacing w:after="0"/>
+            </w:pPr>
+            <w:r>
+              <w:rPr>
+                <w:rFonts w:ascii="Malgun Gothic" w:hAnsi="Malgun Gothic"/>
+                <w:sz w:val="20"/>
+              </w:rPr>
+            </w:r>
+            <w:r>
+              <w:rPr>
+                <w:rFonts w:ascii="Malgun Gothic" w:hAnsi="Malgun Gothic"/>
+                <w:b w:val="0"/>
+                <w:sz w:val="20"/>
+              </w:rPr>
+              <w:t>MIT</w:t>
+            </w:r>
+          </w:p>
+        </w:tc>
+        <w:tc>
+          <w:tcPr>
+            <w:tcW w:type="dxa" w:w="4536"/>
+          </w:tcPr>
+          <w:p>
+            <w:pPr>
+              <w:spacing w:after="0"/>
+            </w:pPr>
+            <w:r>
+              <w:rPr>
+                <w:rFonts w:ascii="Malgun Gothic" w:hAnsi="Malgun Gothic"/>
+                <w:sz w:val="20"/>
+              </w:rPr>
+            </w:r>
+            <w:r>
+              <w:rPr>
+                <w:rFonts w:ascii="Malgun Gothic" w:hAnsi="Malgun Gothic"/>
+                <w:b w:val="0"/>
+                <w:sz w:val="20"/>
+              </w:rPr>
+              <w:t>https://github.com/rivo/uniseg</w:t>
+            </w:r>
+          </w:p>
+        </w:tc>
+        <w:tc>
+          <w:tcPr>
+            <w:tcW w:type="dxa" w:w="4449"/>
+          </w:tcPr>
+          <w:p>
+            <w:pPr>
+              <w:spacing w:after="0"/>
+            </w:pPr>
+            <w:r>
+              <w:rPr>
+                <w:rFonts w:ascii="Malgun Gothic" w:hAnsi="Malgun Gothic"/>
+                <w:sz w:val="20"/>
+              </w:rPr>
+            </w:r>
+            <w:r>
+              <w:rPr>
+                <w:rFonts w:ascii="Malgun Gothic" w:hAnsi="Malgun Gothic"/>
+                <w:b w:val="0"/>
+                <w:sz w:val="20"/>
+              </w:rPr>
+              <w:t>indirect: Transitive terminal/runtime support for the FMON local TUI.</w:t>
+            </w:r>
+          </w:p>
+        </w:tc>
+      </w:tr>
+      <w:tr>
+        <w:tc>
+          <w:tcPr>
+            <w:tcW w:type="dxa" w:w="768"/>
+          </w:tcPr>
+          <w:p>
+            <w:pPr>
+              <w:spacing w:after="0"/>
+            </w:pPr>
+            <w:r>
+              <w:rPr>
+                <w:rFonts w:ascii="Malgun Gothic" w:hAnsi="Malgun Gothic"/>
+                <w:sz w:val="20"/>
+              </w:rPr>
+            </w:r>
+            <w:r>
+              <w:rPr>
+                <w:rFonts w:ascii="Malgun Gothic" w:hAnsi="Malgun Gothic"/>
+                <w:b w:val="0"/>
+                <w:sz w:val="20"/>
+              </w:rPr>
+              <w:t>28</w:t>
+            </w:r>
+          </w:p>
+        </w:tc>
+        <w:tc>
+          <w:tcPr>
+            <w:tcW w:type="dxa" w:w="1878"/>
+          </w:tcPr>
+          <w:p>
+            <w:pPr>
+              <w:spacing w:after="0"/>
+            </w:pPr>
+            <w:r>
+              <w:rPr>
+                <w:rFonts w:ascii="Malgun Gothic" w:hAnsi="Malgun Gothic"/>
+                <w:sz w:val="20"/>
+              </w:rPr>
+            </w:r>
+            <w:r>
+              <w:rPr>
+                <w:rFonts w:ascii="Malgun Gothic" w:hAnsi="Malgun Gothic"/>
+                <w:b w:val="0"/>
+                <w:sz w:val="20"/>
+              </w:rPr>
+              <w:t>golang.org/x/sync</w:t>
+            </w:r>
+          </w:p>
+        </w:tc>
+        <w:tc>
+          <w:tcPr>
+            <w:tcW w:type="dxa" w:w="1387"/>
+          </w:tcPr>
+          <w:p>
+            <w:pPr>
+              <w:spacing w:after="0"/>
+            </w:pPr>
+            <w:r>
+              <w:rPr>
+                <w:rFonts w:ascii="Malgun Gothic" w:hAnsi="Malgun Gothic"/>
+                <w:sz w:val="20"/>
+              </w:rPr>
+            </w:r>
+            <w:r>
+              <w:rPr>
+                <w:rFonts w:ascii="Malgun Gothic" w:hAnsi="Malgun Gothic"/>
+                <w:b w:val="0"/>
+                <w:sz w:val="20"/>
+              </w:rPr>
+              <w:t>v0.11.0</w:t>
+            </w:r>
+          </w:p>
+        </w:tc>
+        <w:tc>
+          <w:tcPr>
+            <w:tcW w:type="dxa" w:w="1495"/>
+          </w:tcPr>
+          <w:p>
+            <w:pPr>
+              <w:spacing w:after="0"/>
+            </w:pPr>
+            <w:r>
+              <w:rPr>
+                <w:rFonts w:ascii="Malgun Gothic" w:hAnsi="Malgun Gothic"/>
+                <w:sz w:val="20"/>
+              </w:rPr>
+            </w:r>
+            <w:r>
+              <w:rPr>
+                <w:rFonts w:ascii="Malgun Gothic" w:hAnsi="Malgun Gothic"/>
+                <w:b w:val="0"/>
+                <w:sz w:val="20"/>
+              </w:rPr>
+              <w:t>BSD-3-Clause</w:t>
+            </w:r>
+          </w:p>
+        </w:tc>
+        <w:tc>
+          <w:tcPr>
+            <w:tcW w:type="dxa" w:w="4536"/>
+          </w:tcPr>
+          <w:p>
+            <w:pPr>
+              <w:spacing w:after="0"/>
+            </w:pPr>
+            <w:r>
+              <w:rPr>
+                <w:rFonts w:ascii="Malgun Gothic" w:hAnsi="Malgun Gothic"/>
+                <w:sz w:val="20"/>
+              </w:rPr>
+            </w:r>
+            <w:r>
+              <w:rPr>
+                <w:rFonts w:ascii="Malgun Gothic" w:hAnsi="Malgun Gothic"/>
+                <w:b w:val="0"/>
+                <w:sz w:val="20"/>
+              </w:rPr>
+              <w:t>https://go.googlesource.com/sync</w:t>
+            </w:r>
+          </w:p>
+        </w:tc>
+        <w:tc>
+          <w:tcPr>
+            <w:tcW w:type="dxa" w:w="4449"/>
+          </w:tcPr>
+          <w:p>
+            <w:pPr>
+              <w:spacing w:after="0"/>
+            </w:pPr>
+            <w:r>
+              <w:rPr>
+                <w:rFonts w:ascii="Malgun Gothic" w:hAnsi="Malgun Gothic"/>
+                <w:sz w:val="20"/>
+              </w:rPr>
+            </w:r>
+            <w:r>
+              <w:rPr>
+                <w:rFonts w:ascii="Malgun Gothic" w:hAnsi="Malgun Gothic"/>
+                <w:b w:val="0"/>
+                <w:sz w:val="20"/>
+              </w:rPr>
+              <w:t>indirect: Transitive terminal/runtime support for the FMON local TUI.</w:t>
+            </w:r>
+          </w:p>
+        </w:tc>
+      </w:tr>
+      <w:tr>
+        <w:tc>
+          <w:tcPr>
+            <w:tcW w:type="dxa" w:w="768"/>
+          </w:tcPr>
+          <w:p>
+            <w:pPr>
+              <w:spacing w:after="0"/>
+            </w:pPr>
+            <w:r>
+              <w:rPr>
+                <w:rFonts w:ascii="Malgun Gothic" w:hAnsi="Malgun Gothic"/>
+                <w:sz w:val="20"/>
+              </w:rPr>
+            </w:r>
+            <w:r>
+              <w:rPr>
+                <w:rFonts w:ascii="Malgun Gothic" w:hAnsi="Malgun Gothic"/>
+                <w:b w:val="0"/>
+                <w:sz w:val="20"/>
+              </w:rPr>
+              <w:t>29</w:t>
+            </w:r>
+          </w:p>
+        </w:tc>
+        <w:tc>
+          <w:tcPr>
+            <w:tcW w:type="dxa" w:w="1878"/>
+          </w:tcPr>
+          <w:p>
+            <w:pPr>
+              <w:spacing w:after="0"/>
+            </w:pPr>
+            <w:r>
+              <w:rPr>
+                <w:rFonts w:ascii="Malgun Gothic" w:hAnsi="Malgun Gothic"/>
+                <w:sz w:val="20"/>
+              </w:rPr>
+            </w:r>
+            <w:r>
+              <w:rPr>
+                <w:rFonts w:ascii="Malgun Gothic" w:hAnsi="Malgun Gothic"/>
+                <w:b w:val="0"/>
+                <w:sz w:val="20"/>
+              </w:rPr>
+              <w:t>golang.org/x/sys</w:t>
+            </w:r>
+          </w:p>
+        </w:tc>
+        <w:tc>
+          <w:tcPr>
+            <w:tcW w:type="dxa" w:w="1387"/>
+          </w:tcPr>
+          <w:p>
+            <w:pPr>
+              <w:spacing w:after="0"/>
+            </w:pPr>
+            <w:r>
+              <w:rPr>
+                <w:rFonts w:ascii="Malgun Gothic" w:hAnsi="Malgun Gothic"/>
+                <w:sz w:val="20"/>
+              </w:rPr>
+            </w:r>
+            <w:r>
+              <w:rPr>
+                <w:rFonts w:ascii="Malgun Gothic" w:hAnsi="Malgun Gothic"/>
+                <w:b w:val="0"/>
+                <w:sz w:val="20"/>
+              </w:rPr>
+              <w:t>v0.30.0</w:t>
+            </w:r>
+          </w:p>
+        </w:tc>
+        <w:tc>
+          <w:tcPr>
+            <w:tcW w:type="dxa" w:w="1495"/>
+          </w:tcPr>
+          <w:p>
+            <w:pPr>
+              <w:spacing w:after="0"/>
+            </w:pPr>
+            <w:r>
+              <w:rPr>
+                <w:rFonts w:ascii="Malgun Gothic" w:hAnsi="Malgun Gothic"/>
+                <w:sz w:val="20"/>
+              </w:rPr>
+            </w:r>
+            <w:r>
+              <w:rPr>
+                <w:rFonts w:ascii="Malgun Gothic" w:hAnsi="Malgun Gothic"/>
+                <w:b w:val="0"/>
+                <w:sz w:val="20"/>
+              </w:rPr>
+              <w:t>BSD-3-Clause</w:t>
+            </w:r>
+          </w:p>
+        </w:tc>
+        <w:tc>
+          <w:tcPr>
+            <w:tcW w:type="dxa" w:w="4536"/>
+          </w:tcPr>
+          <w:p>
+            <w:pPr>
+              <w:spacing w:after="0"/>
+            </w:pPr>
+            <w:r>
+              <w:rPr>
+                <w:rFonts w:ascii="Malgun Gothic" w:hAnsi="Malgun Gothic"/>
+                <w:sz w:val="20"/>
+              </w:rPr>
+            </w:r>
+            <w:r>
+              <w:rPr>
+                <w:rFonts w:ascii="Malgun Gothic" w:hAnsi="Malgun Gothic"/>
+                <w:b w:val="0"/>
+                <w:sz w:val="20"/>
+              </w:rPr>
+              <w:t>https://go.googlesource.com/sys</w:t>
+            </w:r>
+          </w:p>
+        </w:tc>
+        <w:tc>
+          <w:tcPr>
+            <w:tcW w:type="dxa" w:w="4449"/>
+          </w:tcPr>
+          <w:p>
+            <w:pPr>
+              <w:spacing w:after="0"/>
+            </w:pPr>
+            <w:r>
+              <w:rPr>
+                <w:rFonts w:ascii="Malgun Gothic" w:hAnsi="Malgun Gothic"/>
+                <w:sz w:val="20"/>
+              </w:rPr>
+            </w:r>
+            <w:r>
+              <w:rPr>
+                <w:rFonts w:ascii="Malgun Gothic" w:hAnsi="Malgun Gothic"/>
+                <w:b w:val="0"/>
+                <w:sz w:val="20"/>
+              </w:rPr>
+              <w:t>indirect: Transitive terminal/runtime support for the FMON local TUI.</w:t>
+            </w:r>
+          </w:p>
+        </w:tc>
+      </w:tr>
+      <w:tr>
+        <w:tc>
+          <w:tcPr>
+            <w:tcW w:type="dxa" w:w="768"/>
+          </w:tcPr>
+          <w:p>
+            <w:pPr>
+              <w:spacing w:after="0"/>
+            </w:pPr>
+            <w:r>
+              <w:rPr>
+                <w:rFonts w:ascii="Malgun Gothic" w:hAnsi="Malgun Gothic"/>
+                <w:sz w:val="20"/>
+              </w:rPr>
+            </w:r>
+            <w:r>
+              <w:rPr>
+                <w:rFonts w:ascii="Malgun Gothic" w:hAnsi="Malgun Gothic"/>
+                <w:b w:val="0"/>
+                <w:sz w:val="20"/>
+              </w:rPr>
+              <w:t>30</w:t>
+            </w:r>
+          </w:p>
+        </w:tc>
+        <w:tc>
+          <w:tcPr>
+            <w:tcW w:type="dxa" w:w="1878"/>
+          </w:tcPr>
+          <w:p>
+            <w:pPr>
+              <w:spacing w:after="0"/>
+            </w:pPr>
+            <w:r>
+              <w:rPr>
+                <w:rFonts w:ascii="Malgun Gothic" w:hAnsi="Malgun Gothic"/>
+                <w:sz w:val="20"/>
+              </w:rPr>
+            </w:r>
+            <w:r>
+              <w:rPr>
+                <w:rFonts w:ascii="Malgun Gothic" w:hAnsi="Malgun Gothic"/>
+                <w:b w:val="0"/>
+                <w:sz w:val="20"/>
+              </w:rPr>
+              <w:t>golang.org/x/text</w:t>
+            </w:r>
+          </w:p>
+        </w:tc>
+        <w:tc>
+          <w:tcPr>
+            <w:tcW w:type="dxa" w:w="1387"/>
+          </w:tcPr>
+          <w:p>
+            <w:pPr>
+              <w:spacing w:after="0"/>
+            </w:pPr>
+            <w:r>
+              <w:rPr>
+                <w:rFonts w:ascii="Malgun Gothic" w:hAnsi="Malgun Gothic"/>
+                <w:sz w:val="20"/>
+              </w:rPr>
+            </w:r>
+            <w:r>
+              <w:rPr>
+                <w:rFonts w:ascii="Malgun Gothic" w:hAnsi="Malgun Gothic"/>
+                <w:b w:val="0"/>
+                <w:sz w:val="20"/>
+              </w:rPr>
+              <w:t>v0.3.8</w:t>
+            </w:r>
+          </w:p>
+        </w:tc>
+        <w:tc>
+          <w:tcPr>
+            <w:tcW w:type="dxa" w:w="1495"/>
+          </w:tcPr>
+          <w:p>
+            <w:pPr>
+              <w:spacing w:after="0"/>
+            </w:pPr>
+            <w:r>
+              <w:rPr>
+                <w:rFonts w:ascii="Malgun Gothic" w:hAnsi="Malgun Gothic"/>
+                <w:sz w:val="20"/>
+              </w:rPr>
+            </w:r>
+            <w:r>
+              <w:rPr>
+                <w:rFonts w:ascii="Malgun Gothic" w:hAnsi="Malgun Gothic"/>
+                <w:b w:val="0"/>
+                <w:sz w:val="20"/>
+              </w:rPr>
+              <w:t>BSD-3-Clause</w:t>
+            </w:r>
+          </w:p>
+        </w:tc>
+        <w:tc>
+          <w:tcPr>
+            <w:tcW w:type="dxa" w:w="4536"/>
+          </w:tcPr>
+          <w:p>
+            <w:pPr>
+              <w:spacing w:after="0"/>
+            </w:pPr>
+            <w:r>
+              <w:rPr>
+                <w:rFonts w:ascii="Malgun Gothic" w:hAnsi="Malgun Gothic"/>
+                <w:sz w:val="20"/>
+              </w:rPr>
+            </w:r>
+            <w:r>
+              <w:rPr>
+                <w:rFonts w:ascii="Malgun Gothic" w:hAnsi="Malgun Gothic"/>
+                <w:b w:val="0"/>
+                <w:sz w:val="20"/>
+              </w:rPr>
+              <w:t>https://go.googlesource.com/text</w:t>
+            </w:r>
+          </w:p>
+        </w:tc>
+        <w:tc>
+          <w:tcPr>
+            <w:tcW w:type="dxa" w:w="4449"/>
+          </w:tcPr>
+          <w:p>
+            <w:pPr>
+              <w:spacing w:after="0"/>
+            </w:pPr>
+            <w:r>
+              <w:rPr>
+                <w:rFonts w:ascii="Malgun Gothic" w:hAnsi="Malgun Gothic"/>
+                <w:sz w:val="20"/>
+              </w:rPr>
+            </w:r>
+            <w:r>
+              <w:rPr>
+                <w:rFonts w:ascii="Malgun Gothic" w:hAnsi="Malgun Gothic"/>
+                <w:b w:val="0"/>
+                <w:sz w:val="20"/>
+              </w:rPr>
+              <w:t>indirect: Transitive terminal/runtime support for the FMON local TUI.</w:t>
             </w:r>
           </w:p>
         </w:tc>
@@ -4845,9 +7631,9 @@
                 <w:b w:val="0"/>
                 <w:sz w:val="20"/>
               </w:rPr>
-              <w:t>▣ 유형 1: 외부 모델 그대로 활용 — local Ollama-compatible Gemma 4 12B를 후보 주장 생성에 선택적으로 연결. 기본 fixture 경로는 모델 없이 동작.</w:t>
+              <w:t>□ 유형 1</w:t>
               <w:br/>
-              <w:t>□ 유형 2</w:t>
+              <w:t>▣ 유형 2: Gemma 4 12B 기반 candidate-only QLoRA 추가학습(로컬 선택 경로). 기본 deterministic fixture 경로는 모델 없이 동작.</w:t>
               <w:br/>
               <w:t>□ 유형 3</w:t>
             </w:r>
@@ -5001,7 +7787,7 @@
                 <w:b w:val="0"/>
                 <w:sz w:val="20"/>
               </w:rPr>
-              <w:t>Gemma Terms of Use (open-weight; 사용 조건 별도 준수)</w:t>
+              <w:t>Apache-2.0 — Gemma 4 전용 라이선스 적용</w:t>
             </w:r>
           </w:p>
         </w:tc>
@@ -5199,7 +7985,7 @@
                 <w:b w:val="0"/>
                 <w:sz w:val="20"/>
               </w:rPr>
-              <w:t>해당 없음 — 제출되는 기본 제품은 추가 학습 가중치를 탑재하지 않음</w:t>
+              <w:t>MOFA ODA 공개 demo fixture 유래 9건: train 6 / fixture family별 non-overlap bounded holdout 3. 고객·비공개 데이터 없음.</w:t>
             </w:r>
           </w:p>
         </w:tc>
@@ -5282,7 +8068,7 @@
                 <w:b w:val="0"/>
                 <w:sz w:val="20"/>
               </w:rPr>
-              <w:t>해당 없음</w:t>
+              <w:t>CandidateClaim 허용 필드만 유지하고 train/holdout을 분리. response-only loss와 EOS로 strict JSON completion을 학습.</w:t>
             </w:r>
           </w:p>
         </w:tc>
@@ -5355,7 +8141,7 @@
                 <w:b w:val="0"/>
                 <w:sz w:val="20"/>
               </w:rPr>
-              <w:t>해당 없음 — local LoRA prototype은 pipeline evidence이며 배포 제품 가중치가 아님</w:t>
+              <w:t>미배포 — 모델 및 adapter weights는 공개 저장소와 제출 ZIP에 포함하지 않음. 재현 스크립트와 bounded 평가 JSON만 대표 저장소에 공개.</w:t>
             </w:r>
           </w:p>
         </w:tc>
@@ -5428,7 +8214,7 @@
                 <w:b w:val="0"/>
                 <w:sz w:val="20"/>
               </w:rPr>
-              <w:t>해당 없음</w:t>
+              <w:t>Gemma 4 12B QLoRA 60-step, local 4-bit 학습. holdout strict JSON/exact text 3/3, authority violation 0. productionQuality=false이며 운영 정확도 주장이 아님.</w:t>
             </w:r>
           </w:p>
         </w:tc>

</xml_diff>

<commit_message>
refactor: rename public project to claimgate
</commit_message>
<xml_diff>
--- a/artifacts/submission/2026-osscontest/final/2026 오픈소스 개발자대회 결과보고서_접수번호(ClaimGate).docx
+++ b/artifacts/submission/2026-osscontest/final/2026 오픈소스 개발자대회 결과보고서_접수번호(ClaimGate).docx
@@ -908,7 +908,7 @@
                 <w:b w:val="0"/>
                 <w:sz w:val="20"/>
               </w:rPr>
-              <w:t>https://github.com/WooYoungSang/warvis-claimgate</w:t>
+              <w:t>https://github.com/WooYoungSang/claimgate</w:t>
             </w:r>
           </w:p>
         </w:tc>
@@ -8348,7 +8348,7 @@
                 <w:b w:val="0"/>
                 <w:sz w:val="20"/>
               </w:rPr>
-              <w:t>https://github.com/WooYoungSang/warvis-claimgate</w:t>
+              <w:t>https://github.com/WooYoungSang/claimgate</w:t>
             </w:r>
           </w:p>
         </w:tc>

</xml_diff>